<commit_message>
Polish workflow report checks and supporting evidence
</commit_message>
<xml_diff>
--- a/期末考查报告_数字生活方式分析/final_submit/大数据分析与应用期末考查报告.docx
+++ b/期末考查报告_数字生活方式分析/final_submit/大数据分析与应用期末考查报告.docx
@@ -855,7 +855,7 @@
           <w:color w:val="1F4D78"/>
           <w:sz w:val="30"/>
         </w:rPr>
-        <w:t>1. Objective</w:t>
+        <w:t>1. Research Objective and Task Design</w:t>
       </w:r>
     </w:p>
     <w:p>
@@ -909,7 +909,7 @@
           <w:color w:val="2E74B5"/>
           <w:sz w:val="25"/>
         </w:rPr>
-        <w:t>1.2 Questions</w:t>
+        <w:t>1.2 Research Questions</w:t>
       </w:r>
     </w:p>
     <w:p>
@@ -975,7 +975,7 @@
           <w:color w:val="2E74B5"/>
           <w:sz w:val="25"/>
         </w:rPr>
-        <w:t>1.3 Tasks</w:t>
+        <w:t>1.3 Modeling Tasks</w:t>
       </w:r>
     </w:p>
     <w:p>
@@ -1007,7 +1007,7 @@
           <w:color w:val="1F4D78"/>
           <w:sz w:val="30"/>
         </w:rPr>
-        <w:t>2. Dataset</w:t>
+        <w:t>2. Dataset Description and Task Feasibility</w:t>
       </w:r>
     </w:p>
     <w:p>
@@ -1021,33 +1021,33 @@
           <w:color w:val="2E74B5"/>
           <w:sz w:val="25"/>
         </w:rPr>
-        <w:t>2.1 Source</w:t>
-      </w:r>
-    </w:p>
-    <w:p>
-      <w:pPr>
-        <w:spacing w:line="269" w:lineRule="auto" w:after="100"/>
-      </w:pPr>
-      <w:r>
-        <w:rPr>
-          <w:rFonts w:ascii="Calibri" w:hAnsi="Calibri" w:eastAsia="Calibri"/>
-          <w:b w:val="0"/>
-          <w:sz w:val="22"/>
-        </w:rPr>
-        <w:t>The dataset is the 2025 Digital Lifestyle Benchmark Dataset. It is a CSV structured dataset with 3500 rows and 24 fields. It was selected because it naturally supports classification, regression, and clustering in one coherent digital lifestyle scenario.</w:t>
-      </w:r>
-    </w:p>
-    <w:p>
-      <w:pPr>
-        <w:spacing w:line="269" w:lineRule="auto" w:after="100"/>
-      </w:pPr>
-      <w:r>
-        <w:rPr>
-          <w:rFonts w:ascii="Calibri" w:hAnsi="Calibri" w:eastAsia="Calibri"/>
-          <w:b w:val="0"/>
-          <w:sz w:val="22"/>
-        </w:rPr>
-        <w:t>The earlier pfm_train and pfm_test files were not selected as the final dataset because their topic was closer to previous employee-attrition work and did not support the regression and clustering parts as naturally as this dataset.</w:t>
+        <w:t>2.1 Dataset Source</w:t>
+      </w:r>
+    </w:p>
+    <w:p>
+      <w:pPr>
+        <w:spacing w:line="269" w:lineRule="auto" w:after="100"/>
+      </w:pPr>
+      <w:r>
+        <w:rPr>
+          <w:rFonts w:ascii="Calibri" w:hAnsi="Calibri" w:eastAsia="Calibri"/>
+          <w:b w:val="0"/>
+          <w:sz w:val="22"/>
+        </w:rPr>
+        <w:t>The dataset is the 2025 Digital Lifestyle Benchmark Dataset. It is a CSV structured dataset with 3500 rows and 24 fields. It was selected because it naturally supports classification, regression, clustering, preprocessing evidence, and visualization in one coherent digital lifestyle scenario.</w:t>
+      </w:r>
+    </w:p>
+    <w:p>
+      <w:pPr>
+        <w:spacing w:line="269" w:lineRule="auto" w:after="100"/>
+      </w:pPr>
+      <w:r>
+        <w:rPr>
+          <w:rFonts w:ascii="Calibri" w:hAnsi="Calibri" w:eastAsia="Calibri"/>
+          <w:b w:val="0"/>
+          <w:sz w:val="22"/>
+        </w:rPr>
+        <w:t>Other candidate materials were reviewed, but the final dataset was selected because it better supports the complete workflow of classification, regression, clustering, preprocessing, and visualization.</w:t>
       </w:r>
     </w:p>
     <w:p>
@@ -1061,7 +1061,7 @@
           <w:color w:val="2E74B5"/>
           <w:sz w:val="25"/>
         </w:rPr>
-        <w:t>2.2 Fields</w:t>
+        <w:t>2.2 Field Structure</w:t>
       </w:r>
     </w:p>
     <w:p>
@@ -1173,7 +1173,7 @@
           <w:color w:val="2E74B5"/>
           <w:sz w:val="25"/>
         </w:rPr>
-        <w:t>2.3 Task Support</w:t>
+        <w:t>2.3 Task Feasibility</w:t>
       </w:r>
     </w:p>
     <w:p>
@@ -1232,7 +1232,20 @@
           <w:color w:val="1F4D78"/>
           <w:sz w:val="30"/>
         </w:rPr>
-        <w:t>3. Preprocessing</w:t>
+        <w:t>3. Data Preprocessing and Feature Construction</w:t>
+      </w:r>
+    </w:p>
+    <w:p>
+      <w:pPr>
+        <w:spacing w:line="269" w:lineRule="auto" w:after="100"/>
+      </w:pPr>
+      <w:r>
+        <w:rPr>
+          <w:rFonts w:ascii="Calibri" w:hAnsi="Calibri" w:eastAsia="Calibri"/>
+          <w:b w:val="0"/>
+          <w:sz w:val="22"/>
+        </w:rPr>
+        <w:t>This section turns the raw CSV file into a reliable modeling table. The main purpose is to check data quality, construct useful behavior features, and control target leakage before modeling.</w:t>
       </w:r>
     </w:p>
     <w:p>
@@ -1437,7 +1450,7 @@
           <w:color w:val="2E74B5"/>
           <w:sz w:val="25"/>
         </w:rPr>
-        <w:t>3.2 Quality Check</w:t>
+        <w:t>3.2 Missing and Duplicate Check</w:t>
       </w:r>
     </w:p>
     <w:p>
@@ -1726,7 +1739,7 @@
           <w:color w:val="2E74B5"/>
           <w:sz w:val="25"/>
         </w:rPr>
-        <w:t>3.3 Range Check</w:t>
+        <w:t>3.3 Range and Rationality Check</w:t>
       </w:r>
     </w:p>
     <w:p>
@@ -2042,7 +2055,7 @@
           <w:color w:val="2E74B5"/>
           <w:sz w:val="25"/>
         </w:rPr>
-        <w:t>3.5 Feature Selection</w:t>
+        <w:t>3.5 Feature Selection and Leakage Control</w:t>
       </w:r>
     </w:p>
     <w:p>
@@ -2233,7 +2246,7 @@
           <w:color w:val="2E74B5"/>
           <w:sz w:val="25"/>
         </w:rPr>
-        <w:t>3.6 PCA and GMM</w:t>
+        <w:t>3.6 PCA and Probabilistic Clustering Extension</w:t>
       </w:r>
     </w:p>
     <w:p>
@@ -2247,6 +2260,104 @@
           <w:sz w:val="22"/>
         </w:rPr>
         <w:t>PCA is used only for dimensionality reduction visualization and structure understanding. The first two principal components explain about 42.41% variance. PCA is not used as input for classification or regression. Because the clustering inputs are mainly continuous numerical variables, a separate LCA model is not used. GaussianMixture is used as a probabilistic clustering extension to respond to the latent-group idea.</w:t>
+      </w:r>
+    </w:p>
+    <w:p>
+      <w:pPr>
+        <w:spacing w:before="80" w:after="80"/>
+      </w:pPr>
+      <w:r>
+        <w:rPr>
+          <w:rFonts w:ascii="Consolas" w:hAnsi="Consolas" w:eastAsia="Consolas"/>
+          <w:b/>
+          <w:color w:val="9B1C1C"/>
+          <w:sz w:val="21"/>
+        </w:rPr>
+        <w:t>[INSERT TABLE11 SCREENSHOT HERE: screenshot_tables/table11_pca_explained_variance.xlsx]</w:t>
+      </w:r>
+    </w:p>
+    <w:p>
+      <w:pPr>
+        <w:spacing w:line="269" w:lineRule="auto" w:after="100"/>
+      </w:pPr>
+      <w:r>
+        <w:rPr>
+          <w:rFonts w:ascii="Calibri" w:hAnsi="Calibri" w:eastAsia="Calibri"/>
+          <w:b/>
+          <w:sz w:val="22"/>
+        </w:rPr>
+        <w:t>Table11</w:t>
+      </w:r>
+      <w:r>
+        <w:rPr>
+          <w:rFonts w:ascii="Calibri" w:hAnsi="Calibri" w:eastAsia="Calibri"/>
+          <w:b w:val="0"/>
+          <w:sz w:val="22"/>
+        </w:rPr>
+        <w:t xml:space="preserve"> PCA Explained Variance</w:t>
+      </w:r>
+    </w:p>
+    <w:p>
+      <w:pPr>
+        <w:spacing w:line="269" w:lineRule="auto" w:after="100"/>
+      </w:pPr>
+      <w:r>
+        <w:rPr>
+          <w:rFonts w:ascii="Calibri" w:hAnsi="Calibri" w:eastAsia="Calibri"/>
+          <w:b/>
+          <w:sz w:val="22"/>
+        </w:rPr>
+        <w:t>Purpose:</w:t>
+      </w:r>
+      <w:r>
+        <w:rPr>
+          <w:rFonts w:ascii="Calibri" w:hAnsi="Calibri" w:eastAsia="Calibri"/>
+          <w:b w:val="0"/>
+          <w:sz w:val="22"/>
+        </w:rPr>
+        <w:t xml:space="preserve"> This screenshot records the explained variance ratio and cumulative explained variance of PCA components.</w:t>
+      </w:r>
+    </w:p>
+    <w:p>
+      <w:pPr>
+        <w:spacing w:line="269" w:lineRule="auto" w:after="100"/>
+      </w:pPr>
+      <w:r>
+        <w:rPr>
+          <w:rFonts w:ascii="Calibri" w:hAnsi="Calibri" w:eastAsia="Calibri"/>
+          <w:b/>
+          <w:sz w:val="22"/>
+        </w:rPr>
+        <w:t>Interpretation:</w:t>
+      </w:r>
+      <w:r>
+        <w:rPr>
+          <w:rFonts w:ascii="Calibri" w:hAnsi="Calibri" w:eastAsia="Calibri"/>
+          <w:b w:val="0"/>
+          <w:sz w:val="22"/>
+        </w:rPr>
+        <w:t xml:space="preserve"> PC1 and PC2 explain about 42.41% of the total variance, so a two-dimensional PCA view only captures part of the high-dimensional behavior structure.</w:t>
+      </w:r>
+    </w:p>
+    <w:p>
+      <w:pPr>
+        <w:spacing w:line="269" w:lineRule="auto" w:after="100"/>
+      </w:pPr>
+      <w:r>
+        <w:rPr>
+          <w:rFonts w:ascii="Calibri" w:hAnsi="Calibri" w:eastAsia="Calibri"/>
+          <w:b/>
+          <w:sz w:val="22"/>
+        </w:rPr>
+        <w:t>Conclusion:</w:t>
+      </w:r>
+      <w:r>
+        <w:rPr>
+          <w:rFonts w:ascii="Calibri" w:hAnsi="Calibri" w:eastAsia="Calibri"/>
+          <w:b w:val="0"/>
+          <w:sz w:val="22"/>
+        </w:rPr>
+        <w:t xml:space="preserve"> The PCA evidence supports dimensionality-reduction discussion, but PCA is used only for auxiliary understanding rather than replacing the original modeling features.</w:t>
       </w:r>
     </w:p>
     <w:p>
@@ -2265,7 +2376,20 @@
           <w:color w:val="1F4D78"/>
           <w:sz w:val="30"/>
         </w:rPr>
-        <w:t>4. EDA</w:t>
+        <w:t>4. Statistical Exploration and Visualization</w:t>
+      </w:r>
+    </w:p>
+    <w:p>
+      <w:pPr>
+        <w:spacing w:line="269" w:lineRule="auto" w:after="100"/>
+      </w:pPr>
+      <w:r>
+        <w:rPr>
+          <w:rFonts w:ascii="Calibri" w:hAnsi="Calibri" w:eastAsia="Calibri"/>
+          <w:b w:val="0"/>
+          <w:sz w:val="22"/>
+        </w:rPr>
+        <w:t>This section uses statistical summaries and visualizations to understand the mathematical structure of the dataset before modeling. The goal is to connect raw variables with later modeling choices instead of using figures as decoration.</w:t>
       </w:r>
     </w:p>
     <w:p>
@@ -2339,7 +2463,7 @@
           <w:b w:val="0"/>
           <w:sz w:val="22"/>
         </w:rPr>
-        <w:t xml:space="preserve"> High Risk and No Risk Distribution</w:t>
+        <w:t xml:space="preserve"> High Risk vs No Risk Sample Structure</w:t>
       </w:r>
     </w:p>
     <w:p>
@@ -2416,7 +2540,7 @@
           <w:color w:val="2E74B5"/>
           <w:sz w:val="25"/>
         </w:rPr>
-        <w:t>4.2 Feature Distribution</w:t>
+        <w:t>4.2 Numeric Feature Distributions</w:t>
       </w:r>
     </w:p>
     <w:p>
@@ -2476,7 +2600,7 @@
           <w:b w:val="0"/>
           <w:sz w:val="22"/>
         </w:rPr>
-        <w:t xml:space="preserve"> Core Numeric Feature Distributions</w:t>
+        <w:t xml:space="preserve"> Core Digital Lifestyle Feature Distributions</w:t>
       </w:r>
     </w:p>
     <w:p>
@@ -2553,7 +2677,7 @@
           <w:color w:val="2E74B5"/>
           <w:sz w:val="25"/>
         </w:rPr>
-        <w:t>4.3 Correlation</w:t>
+        <w:t>4.3 Correlation Structure</w:t>
       </w:r>
     </w:p>
     <w:p>
@@ -2613,7 +2737,7 @@
           <w:b w:val="0"/>
           <w:sz w:val="22"/>
         </w:rPr>
-        <w:t xml:space="preserve"> Correlation Heatmap</w:t>
+        <w:t xml:space="preserve"> Correlation Structure of Digital Lifestyle Variables</w:t>
       </w:r>
     </w:p>
     <w:p>
@@ -2690,7 +2814,7 @@
           <w:color w:val="2E74B5"/>
           <w:sz w:val="25"/>
         </w:rPr>
-        <w:t>4.4 Group Difference</w:t>
+        <w:t>4.4 High Risk and No Risk Group Difference</w:t>
       </w:r>
     </w:p>
     <w:p>
@@ -2750,7 +2874,7 @@
           <w:b w:val="0"/>
           <w:sz w:val="22"/>
         </w:rPr>
-        <w:t xml:space="preserve"> High Risk vs No Risk Behavioral Differences</w:t>
+        <w:t xml:space="preserve"> Behavioral Difference Between High Risk and No Risk Groups</w:t>
       </w:r>
     </w:p>
     <w:p>
@@ -2859,7 +2983,7 @@
           <w:color w:val="1F4D78"/>
           <w:sz w:val="30"/>
         </w:rPr>
-        <w:t>5. Modeling</w:t>
+        <w:t>5. Modeling, Tuning, and Evaluation</w:t>
       </w:r>
     </w:p>
     <w:p>
@@ -2873,7 +2997,7 @@
           <w:color w:val="2E74B5"/>
           <w:sz w:val="25"/>
         </w:rPr>
-        <w:t>5.1 Setup</w:t>
+        <w:t>5.1 Experimental Setup</w:t>
       </w:r>
     </w:p>
     <w:p>
@@ -2900,7 +3024,7 @@
           <w:color w:val="2E74B5"/>
           <w:sz w:val="25"/>
         </w:rPr>
-        <w:t>5.2 Classification</w:t>
+        <w:t>5.2 High Risk Classification</w:t>
       </w:r>
     </w:p>
     <w:p>
@@ -3071,7 +3195,7 @@
           <w:b w:val="0"/>
           <w:sz w:val="22"/>
         </w:rPr>
-        <w:t xml:space="preserve"> Classification Threshold Tuning</w:t>
+        <w:t xml:space="preserve"> Threshold Tuning for Recall-Oriented Screening</w:t>
       </w:r>
     </w:p>
     <w:p>
@@ -3194,7 +3318,7 @@
           <w:b w:val="0"/>
           <w:sz w:val="22"/>
         </w:rPr>
-        <w:t xml:space="preserve"> Confusion Matrix</w:t>
+        <w:t xml:space="preserve"> Confusion Matrix of the Final High Risk Classifier</w:t>
       </w:r>
     </w:p>
     <w:p>
@@ -3317,7 +3441,7 @@
           <w:b w:val="0"/>
           <w:sz w:val="22"/>
         </w:rPr>
-        <w:t xml:space="preserve"> Precision-Recall Curve</w:t>
+        <w:t xml:space="preserve"> Precision-Recall Curve under Class Imbalance</w:t>
       </w:r>
     </w:p>
     <w:p>
@@ -3473,7 +3597,7 @@
           <w:color w:val="2E74B5"/>
           <w:sz w:val="25"/>
         </w:rPr>
-        <w:t>5.3 Regression</w:t>
+        <w:t>5.3 Digital Dependence and Productivity Regression</w:t>
       </w:r>
     </w:p>
     <w:p>
@@ -3644,7 +3768,7 @@
           <w:b w:val="0"/>
           <w:sz w:val="22"/>
         </w:rPr>
-        <w:t xml:space="preserve"> Digital Dependence Observed vs Predicted</w:t>
+        <w:t xml:space="preserve"> Digital Dependence: Observed vs Predicted Scores</w:t>
       </w:r>
     </w:p>
     <w:p>
@@ -3708,210 +3832,6 @@
           <w:sz w:val="22"/>
         </w:rPr>
         <w:t xml:space="preserve"> The regression result supports using digital behavior features to predict digital dependence, but it should not be written as a causal conclusion.</w:t>
-      </w:r>
-    </w:p>
-    <w:p>
-      <w:pPr>
-        <w:spacing w:before="80" w:after="80"/>
-      </w:pPr>
-      <w:r>
-        <w:rPr>
-          <w:rFonts w:ascii="Consolas" w:hAnsi="Consolas" w:eastAsia="Consolas"/>
-          <w:b/>
-          <w:color w:val="9B1C1C"/>
-          <w:sz w:val="21"/>
-        </w:rPr>
-        <w:t>[PASTE CODE6 HERE FROM report_code_snippets.md: Code6 Regression Evaluation]</w:t>
-      </w:r>
-    </w:p>
-    <w:p>
-      <w:pPr>
-        <w:spacing w:line="269" w:lineRule="auto" w:after="100"/>
-      </w:pPr>
-      <w:r>
-        <w:rPr>
-          <w:rFonts w:ascii="Calibri" w:hAnsi="Calibri" w:eastAsia="Calibri"/>
-          <w:b w:val="0"/>
-          <w:sz w:val="22"/>
-        </w:rPr>
-        <w:t>Explanation: This code is used to calculate R², MSE, RMSE, and MAE for regression predictions.</w:t>
-      </w:r>
-    </w:p>
-    <w:p>
-      <w:pPr>
-        <w:spacing w:line="269" w:lineRule="auto" w:after="100"/>
-      </w:pPr>
-      <w:r>
-        <w:rPr>
-          <w:rFonts w:ascii="Calibri" w:hAnsi="Calibri" w:eastAsia="Calibri"/>
-          <w:b w:val="0"/>
-          <w:sz w:val="22"/>
-        </w:rPr>
-        <w:t>It is necessary because regression quality cannot be judged by classification metrics.</w:t>
-      </w:r>
-    </w:p>
-    <w:p>
-      <w:pPr>
-        <w:spacing w:line="269" w:lineRule="auto" w:after="100"/>
-      </w:pPr>
-      <w:r>
-        <w:rPr>
-          <w:rFonts w:ascii="Calibri" w:hAnsi="Calibri" w:eastAsia="Calibri"/>
-          <w:b w:val="0"/>
-          <w:sz w:val="22"/>
-        </w:rPr>
-        <w:t>The output is a metrics table for each regression target.</w:t>
-      </w:r>
-    </w:p>
-    <w:p>
-      <w:pPr>
-        <w:spacing w:line="269" w:lineRule="auto" w:after="100"/>
-      </w:pPr>
-      <w:r>
-        <w:rPr>
-          <w:rFonts w:ascii="Calibri" w:hAnsi="Calibri" w:eastAsia="Calibri"/>
-          <w:b w:val="0"/>
-          <w:sz w:val="22"/>
-        </w:rPr>
-        <w:t>This result supports the comparison between strong digital dependence prediction and weak productivity prediction.</w:t>
-      </w:r>
-    </w:p>
-    <w:p>
-      <w:pPr>
-        <w:spacing w:line="269" w:lineRule="auto" w:after="100"/>
-      </w:pPr>
-      <w:r>
-        <w:rPr>
-          <w:rFonts w:ascii="Calibri" w:hAnsi="Calibri" w:eastAsia="Calibri"/>
-          <w:b w:val="0"/>
-          <w:sz w:val="22"/>
-        </w:rPr>
-        <w:t>The regression results show two different outcomes. Digital dependence can be strongly represented by the current behavioral features, but productivity cannot. This contrast is important because model performance depends on whether the selected features contain enough information for the target variable.</w:t>
-      </w:r>
-    </w:p>
-    <w:p>
-      <w:pPr>
-        <w:pStyle w:val="2"/>
-      </w:pPr>
-      <w:r>
-        <w:rPr>
-          <w:rFonts w:ascii="Calibri" w:hAnsi="Calibri" w:eastAsia="Calibri"/>
-          <w:b/>
-          <w:color w:val="2E74B5"/>
-          <w:sz w:val="25"/>
-        </w:rPr>
-        <w:t>5.4 Clustering</w:t>
-      </w:r>
-    </w:p>
-    <w:p>
-      <w:pPr>
-        <w:spacing w:line="269" w:lineRule="auto" w:after="100"/>
-      </w:pPr>
-      <w:r>
-        <w:rPr>
-          <w:rFonts w:ascii="Calibri" w:hAnsi="Calibri" w:eastAsia="Calibri"/>
-          <w:b w:val="0"/>
-          <w:sz w:val="22"/>
-        </w:rPr>
-        <w:t>Clustering is used to build exploratory digital lifestyle profiles. The input uses only digital behavior and lifestyle numerical features. It does not use high_risk_flag, digital_dependence_score, or productivity_score as clustering input because those variables are outcomes for interpretation, not grouping features.</w:t>
-      </w:r>
-    </w:p>
-    <w:p>
-      <w:pPr>
-        <w:spacing w:before="80" w:after="80"/>
-      </w:pPr>
-      <w:r>
-        <w:rPr>
-          <w:rFonts w:ascii="Consolas" w:hAnsi="Consolas" w:eastAsia="Consolas"/>
-          <w:b/>
-          <w:color w:val="9B1C1C"/>
-          <w:sz w:val="21"/>
-        </w:rPr>
-        <w:t>[INSERT TABLE10 SCREENSHOT HERE: screenshot_tables/table10_clustering_profiles.xlsx]</w:t>
-      </w:r>
-    </w:p>
-    <w:p>
-      <w:pPr>
-        <w:spacing w:line="269" w:lineRule="auto" w:after="100"/>
-      </w:pPr>
-      <w:r>
-        <w:rPr>
-          <w:rFonts w:ascii="Calibri" w:hAnsi="Calibri" w:eastAsia="Calibri"/>
-          <w:b/>
-          <w:sz w:val="22"/>
-        </w:rPr>
-        <w:t>Table10</w:t>
-      </w:r>
-      <w:r>
-        <w:rPr>
-          <w:rFonts w:ascii="Calibri" w:hAnsi="Calibri" w:eastAsia="Calibri"/>
-          <w:b w:val="0"/>
-          <w:sz w:val="22"/>
-        </w:rPr>
-        <w:t xml:space="preserve"> Clustering Profiles</w:t>
-      </w:r>
-    </w:p>
-    <w:p>
-      <w:pPr>
-        <w:spacing w:line="269" w:lineRule="auto" w:after="100"/>
-      </w:pPr>
-      <w:r>
-        <w:rPr>
-          <w:rFonts w:ascii="Calibri" w:hAnsi="Calibri" w:eastAsia="Calibri"/>
-          <w:b/>
-          <w:sz w:val="22"/>
-        </w:rPr>
-        <w:t>Purpose:</w:t>
-      </w:r>
-      <w:r>
-        <w:rPr>
-          <w:rFonts w:ascii="Calibri" w:hAnsi="Calibri" w:eastAsia="Calibri"/>
-          <w:b w:val="0"/>
-          <w:sz w:val="22"/>
-        </w:rPr>
-        <w:t xml:space="preserve"> This screenshot records KMeans k=3, Silhouette=0.1860, and the compact cluster profiles.</w:t>
-      </w:r>
-    </w:p>
-    <w:p>
-      <w:pPr>
-        <w:spacing w:line="269" w:lineRule="auto" w:after="100"/>
-      </w:pPr>
-      <w:r>
-        <w:rPr>
-          <w:rFonts w:ascii="Calibri" w:hAnsi="Calibri" w:eastAsia="Calibri"/>
-          <w:b/>
-          <w:sz w:val="22"/>
-        </w:rPr>
-        <w:t>Interpretation:</w:t>
-      </w:r>
-      <w:r>
-        <w:rPr>
-          <w:rFonts w:ascii="Calibri" w:hAnsi="Calibri" w:eastAsia="Calibri"/>
-          <w:b w:val="0"/>
-          <w:sz w:val="22"/>
-        </w:rPr>
-        <w:t xml:space="preserve"> Cluster 0 is a High social-media-use profile, Cluster 1 is a High device-dependence profile, and Cluster 2 is a Low-load balanced profile.</w:t>
-      </w:r>
-    </w:p>
-    <w:p>
-      <w:pPr>
-        <w:spacing w:line="269" w:lineRule="auto" w:after="100"/>
-      </w:pPr>
-      <w:r>
-        <w:rPr>
-          <w:rFonts w:ascii="Calibri" w:hAnsi="Calibri" w:eastAsia="Calibri"/>
-          <w:b/>
-          <w:sz w:val="22"/>
-        </w:rPr>
-        <w:t>Conclusion:</w:t>
-      </w:r>
-      <w:r>
-        <w:rPr>
-          <w:rFonts w:ascii="Calibri" w:hAnsi="Calibri" w:eastAsia="Calibri"/>
-          <w:b w:val="0"/>
-          <w:sz w:val="22"/>
-        </w:rPr>
-        <w:t xml:space="preserve"> The profiles are readable, but the low silhouette score means the cluster boundaries are weak.</w:t>
       </w:r>
     </w:p>
     <w:p>
@@ -3921,7 +3841,7 @@
       <w:r>
         <w:drawing>
           <wp:inline xmlns:a="http://schemas.openxmlformats.org/drawingml/2006/main" xmlns:pic="http://schemas.openxmlformats.org/drawingml/2006/picture">
-            <wp:extent cx="5349240" cy="3284296"/>
+            <wp:extent cx="5349240" cy="4225867"/>
             <wp:docPr id="9" name="Picture 9"/>
             <wp:cNvGraphicFramePr>
               <a:graphicFrameLocks noChangeAspect="1"/>
@@ -3930,11 +3850,338 @@
               <a:graphicData uri="http://schemas.openxmlformats.org/drawingml/2006/picture">
                 <pic:pic>
                   <pic:nvPicPr>
-                    <pic:cNvPr id="0" name="fig9_kmeans_k_selection.png"/>
+                    <pic:cNvPr id="0" name="fig9_productivity_observed_predicted.png"/>
                     <pic:cNvPicPr/>
                   </pic:nvPicPr>
                   <pic:blipFill>
                     <a:blip r:embed="rId20"/>
+                    <a:stretch>
+                      <a:fillRect/>
+                    </a:stretch>
+                  </pic:blipFill>
+                  <pic:spPr>
+                    <a:xfrm>
+                      <a:off x="0" y="0"/>
+                      <a:ext cx="5349240" cy="4225867"/>
+                    </a:xfrm>
+                    <a:prstGeom prst="rect"/>
+                  </pic:spPr>
+                </pic:pic>
+              </a:graphicData>
+            </a:graphic>
+          </wp:inline>
+        </w:drawing>
+      </w:r>
+    </w:p>
+    <w:p>
+      <w:pPr>
+        <w:spacing w:line="269" w:lineRule="auto" w:after="100"/>
+      </w:pPr>
+      <w:r>
+        <w:rPr>
+          <w:rFonts w:ascii="Calibri" w:hAnsi="Calibri" w:eastAsia="Calibri"/>
+          <w:b/>
+          <w:sz w:val="22"/>
+        </w:rPr>
+        <w:t>Fig9</w:t>
+      </w:r>
+      <w:r>
+        <w:rPr>
+          <w:rFonts w:ascii="Calibri" w:hAnsi="Calibri" w:eastAsia="Calibri"/>
+          <w:b w:val="0"/>
+          <w:sz w:val="22"/>
+        </w:rPr>
+        <w:t xml:space="preserve"> Productivity Weak Prediction: Observed vs Predicted Scores</w:t>
+      </w:r>
+    </w:p>
+    <w:p>
+      <w:pPr>
+        <w:spacing w:line="269" w:lineRule="auto" w:after="100"/>
+      </w:pPr>
+      <w:r>
+        <w:rPr>
+          <w:rFonts w:ascii="Calibri" w:hAnsi="Calibri" w:eastAsia="Calibri"/>
+          <w:b/>
+          <w:sz w:val="22"/>
+        </w:rPr>
+        <w:t>Purpose:</w:t>
+      </w:r>
+      <w:r>
+        <w:rPr>
+          <w:rFonts w:ascii="Calibri" w:hAnsi="Calibri" w:eastAsia="Calibri"/>
+          <w:b w:val="0"/>
+          <w:sz w:val="22"/>
+        </w:rPr>
+        <w:t xml:space="preserve"> This figure checks whether the current feature set can predict productivity_score as well as digital_dependence_score.</w:t>
+      </w:r>
+    </w:p>
+    <w:p>
+      <w:pPr>
+        <w:spacing w:line="269" w:lineRule="auto" w:after="100"/>
+      </w:pPr>
+      <w:r>
+        <w:rPr>
+          <w:rFonts w:ascii="Calibri" w:hAnsi="Calibri" w:eastAsia="Calibri"/>
+          <w:b/>
+          <w:sz w:val="22"/>
+        </w:rPr>
+        <w:t>Interpretation:</w:t>
+      </w:r>
+      <w:r>
+        <w:rPr>
+          <w:rFonts w:ascii="Calibri" w:hAnsi="Calibri" w:eastAsia="Calibri"/>
+          <w:b w:val="0"/>
+          <w:sz w:val="22"/>
+        </w:rPr>
+        <w:t xml:space="preserve"> The points are widely scattered instead of staying close to the diagonal reference line. This pattern is consistent with the weak R²=-0.0041 result.</w:t>
+      </w:r>
+    </w:p>
+    <w:p>
+      <w:pPr>
+        <w:spacing w:line="269" w:lineRule="auto" w:after="100"/>
+      </w:pPr>
+      <w:r>
+        <w:rPr>
+          <w:rFonts w:ascii="Calibri" w:hAnsi="Calibri" w:eastAsia="Calibri"/>
+          <w:b/>
+          <w:sz w:val="22"/>
+        </w:rPr>
+        <w:t>Conclusion:</w:t>
+      </w:r>
+      <w:r>
+        <w:rPr>
+          <w:rFonts w:ascii="Calibri" w:hAnsi="Calibri" w:eastAsia="Calibri"/>
+          <w:b w:val="0"/>
+          <w:sz w:val="22"/>
+        </w:rPr>
+        <w:t xml:space="preserve"> The weak prediction is still meaningful because productivity may depend on motivation, task difficulty, learning environment, self-control, and work context, which are not fully captured by the current digital behavior features.</w:t>
+      </w:r>
+    </w:p>
+    <w:p>
+      <w:pPr>
+        <w:spacing w:before="80" w:after="80"/>
+      </w:pPr>
+      <w:r>
+        <w:rPr>
+          <w:rFonts w:ascii="Consolas" w:hAnsi="Consolas" w:eastAsia="Consolas"/>
+          <w:b/>
+          <w:color w:val="9B1C1C"/>
+          <w:sz w:val="21"/>
+        </w:rPr>
+        <w:t>[PASTE CODE6 HERE FROM report_code_snippets.md: Code6 Regression Evaluation]</w:t>
+      </w:r>
+    </w:p>
+    <w:p>
+      <w:pPr>
+        <w:spacing w:line="269" w:lineRule="auto" w:after="100"/>
+      </w:pPr>
+      <w:r>
+        <w:rPr>
+          <w:rFonts w:ascii="Calibri" w:hAnsi="Calibri" w:eastAsia="Calibri"/>
+          <w:b w:val="0"/>
+          <w:sz w:val="22"/>
+        </w:rPr>
+        <w:t>Explanation: This code is used to calculate R², MSE, RMSE, and MAE for regression predictions.</w:t>
+      </w:r>
+    </w:p>
+    <w:p>
+      <w:pPr>
+        <w:spacing w:line="269" w:lineRule="auto" w:after="100"/>
+      </w:pPr>
+      <w:r>
+        <w:rPr>
+          <w:rFonts w:ascii="Calibri" w:hAnsi="Calibri" w:eastAsia="Calibri"/>
+          <w:b w:val="0"/>
+          <w:sz w:val="22"/>
+        </w:rPr>
+        <w:t>It is necessary because regression quality cannot be judged by classification metrics.</w:t>
+      </w:r>
+    </w:p>
+    <w:p>
+      <w:pPr>
+        <w:spacing w:line="269" w:lineRule="auto" w:after="100"/>
+      </w:pPr>
+      <w:r>
+        <w:rPr>
+          <w:rFonts w:ascii="Calibri" w:hAnsi="Calibri" w:eastAsia="Calibri"/>
+          <w:b w:val="0"/>
+          <w:sz w:val="22"/>
+        </w:rPr>
+        <w:t>The output is a metrics table for each regression target.</w:t>
+      </w:r>
+    </w:p>
+    <w:p>
+      <w:pPr>
+        <w:spacing w:line="269" w:lineRule="auto" w:after="100"/>
+      </w:pPr>
+      <w:r>
+        <w:rPr>
+          <w:rFonts w:ascii="Calibri" w:hAnsi="Calibri" w:eastAsia="Calibri"/>
+          <w:b w:val="0"/>
+          <w:sz w:val="22"/>
+        </w:rPr>
+        <w:t>This result supports the comparison between strong digital dependence prediction and weak productivity prediction.</w:t>
+      </w:r>
+    </w:p>
+    <w:p>
+      <w:pPr>
+        <w:spacing w:line="269" w:lineRule="auto" w:after="100"/>
+      </w:pPr>
+      <w:r>
+        <w:rPr>
+          <w:rFonts w:ascii="Calibri" w:hAnsi="Calibri" w:eastAsia="Calibri"/>
+          <w:b w:val="0"/>
+          <w:sz w:val="22"/>
+        </w:rPr>
+        <w:t>The regression results show two different outcomes. Digital dependence can be strongly represented by the current behavioral features, but productivity cannot. This contrast is important because model performance depends on whether the selected features contain enough information for the target variable.</w:t>
+      </w:r>
+    </w:p>
+    <w:p>
+      <w:pPr>
+        <w:pStyle w:val="2"/>
+      </w:pPr>
+      <w:r>
+        <w:rPr>
+          <w:rFonts w:ascii="Calibri" w:hAnsi="Calibri" w:eastAsia="Calibri"/>
+          <w:b/>
+          <w:color w:val="2E74B5"/>
+          <w:sz w:val="25"/>
+        </w:rPr>
+        <w:t>5.4 Digital Lifestyle Clustering</w:t>
+      </w:r>
+    </w:p>
+    <w:p>
+      <w:pPr>
+        <w:spacing w:line="269" w:lineRule="auto" w:after="100"/>
+      </w:pPr>
+      <w:r>
+        <w:rPr>
+          <w:rFonts w:ascii="Calibri" w:hAnsi="Calibri" w:eastAsia="Calibri"/>
+          <w:b w:val="0"/>
+          <w:sz w:val="22"/>
+        </w:rPr>
+        <w:t>Clustering is used to build exploratory digital lifestyle profiles. The input uses only digital behavior and lifestyle numerical features. It does not use high_risk_flag, digital_dependence_score, or productivity_score as clustering input because those variables are outcomes for interpretation, not grouping features.</w:t>
+      </w:r>
+    </w:p>
+    <w:p>
+      <w:pPr>
+        <w:spacing w:before="80" w:after="80"/>
+      </w:pPr>
+      <w:r>
+        <w:rPr>
+          <w:rFonts w:ascii="Consolas" w:hAnsi="Consolas" w:eastAsia="Consolas"/>
+          <w:b/>
+          <w:color w:val="9B1C1C"/>
+          <w:sz w:val="21"/>
+        </w:rPr>
+        <w:t>[INSERT TABLE10 SCREENSHOT HERE: screenshot_tables/table10_clustering_profiles.xlsx]</w:t>
+      </w:r>
+    </w:p>
+    <w:p>
+      <w:pPr>
+        <w:spacing w:line="269" w:lineRule="auto" w:after="100"/>
+      </w:pPr>
+      <w:r>
+        <w:rPr>
+          <w:rFonts w:ascii="Calibri" w:hAnsi="Calibri" w:eastAsia="Calibri"/>
+          <w:b/>
+          <w:sz w:val="22"/>
+        </w:rPr>
+        <w:t>Table10</w:t>
+      </w:r>
+      <w:r>
+        <w:rPr>
+          <w:rFonts w:ascii="Calibri" w:hAnsi="Calibri" w:eastAsia="Calibri"/>
+          <w:b w:val="0"/>
+          <w:sz w:val="22"/>
+        </w:rPr>
+        <w:t xml:space="preserve"> Clustering Profiles</w:t>
+      </w:r>
+    </w:p>
+    <w:p>
+      <w:pPr>
+        <w:spacing w:line="269" w:lineRule="auto" w:after="100"/>
+      </w:pPr>
+      <w:r>
+        <w:rPr>
+          <w:rFonts w:ascii="Calibri" w:hAnsi="Calibri" w:eastAsia="Calibri"/>
+          <w:b/>
+          <w:sz w:val="22"/>
+        </w:rPr>
+        <w:t>Purpose:</w:t>
+      </w:r>
+      <w:r>
+        <w:rPr>
+          <w:rFonts w:ascii="Calibri" w:hAnsi="Calibri" w:eastAsia="Calibri"/>
+          <w:b w:val="0"/>
+          <w:sz w:val="22"/>
+        </w:rPr>
+        <w:t xml:space="preserve"> This screenshot records KMeans k=3, Silhouette=0.1860, and the compact cluster profiles.</w:t>
+      </w:r>
+    </w:p>
+    <w:p>
+      <w:pPr>
+        <w:spacing w:line="269" w:lineRule="auto" w:after="100"/>
+      </w:pPr>
+      <w:r>
+        <w:rPr>
+          <w:rFonts w:ascii="Calibri" w:hAnsi="Calibri" w:eastAsia="Calibri"/>
+          <w:b/>
+          <w:sz w:val="22"/>
+        </w:rPr>
+        <w:t>Interpretation:</w:t>
+      </w:r>
+      <w:r>
+        <w:rPr>
+          <w:rFonts w:ascii="Calibri" w:hAnsi="Calibri" w:eastAsia="Calibri"/>
+          <w:b w:val="0"/>
+          <w:sz w:val="22"/>
+        </w:rPr>
+        <w:t xml:space="preserve"> Cluster 0 is a High social-media-use profile, Cluster 1 is a High device-dependence profile, and Cluster 2 is a Low-load balanced profile.</w:t>
+      </w:r>
+    </w:p>
+    <w:p>
+      <w:pPr>
+        <w:spacing w:line="269" w:lineRule="auto" w:after="100"/>
+      </w:pPr>
+      <w:r>
+        <w:rPr>
+          <w:rFonts w:ascii="Calibri" w:hAnsi="Calibri" w:eastAsia="Calibri"/>
+          <w:b/>
+          <w:sz w:val="22"/>
+        </w:rPr>
+        <w:t>Conclusion:</w:t>
+      </w:r>
+      <w:r>
+        <w:rPr>
+          <w:rFonts w:ascii="Calibri" w:hAnsi="Calibri" w:eastAsia="Calibri"/>
+          <w:b w:val="0"/>
+          <w:sz w:val="22"/>
+        </w:rPr>
+        <w:t xml:space="preserve"> The profiles are readable, but the low silhouette score means the cluster boundaries are weak.</w:t>
+      </w:r>
+    </w:p>
+    <w:p>
+      <w:pPr>
+        <w:jc w:val="center"/>
+      </w:pPr>
+      <w:r>
+        <w:drawing>
+          <wp:inline xmlns:a="http://schemas.openxmlformats.org/drawingml/2006/main" xmlns:pic="http://schemas.openxmlformats.org/drawingml/2006/picture">
+            <wp:extent cx="5349240" cy="3284296"/>
+            <wp:docPr id="10" name="Picture 10"/>
+            <wp:cNvGraphicFramePr>
+              <a:graphicFrameLocks noChangeAspect="1"/>
+            </wp:cNvGraphicFramePr>
+            <a:graphic>
+              <a:graphicData uri="http://schemas.openxmlformats.org/drawingml/2006/picture">
+                <pic:pic>
+                  <pic:nvPicPr>
+                    <pic:cNvPr id="0" name="fig10_kmeans_k_selection.png"/>
+                    <pic:cNvPicPr/>
+                  </pic:nvPicPr>
+                  <pic:blipFill>
+                    <a:blip r:embed="rId21"/>
                     <a:stretch>
                       <a:fillRect/>
                     </a:stretch>
@@ -3963,15 +4210,15 @@
           <w:b/>
           <w:sz w:val="22"/>
         </w:rPr>
-        <w:t>Fig9</w:t>
-      </w:r>
-      <w:r>
-        <w:rPr>
-          <w:rFonts w:ascii="Calibri" w:hAnsi="Calibri" w:eastAsia="Calibri"/>
-          <w:b w:val="0"/>
-          <w:sz w:val="22"/>
-        </w:rPr>
-        <w:t xml:space="preserve"> K Selection for KMeans</w:t>
+        <w:t>Fig10</w:t>
+      </w:r>
+      <w:r>
+        <w:rPr>
+          <w:rFonts w:ascii="Calibri" w:hAnsi="Calibri" w:eastAsia="Calibri"/>
+          <w:b w:val="0"/>
+          <w:sz w:val="22"/>
+        </w:rPr>
+        <w:t xml:space="preserve"> KMeans k Selection by Elbow and Silhouette</w:t>
       </w:r>
     </w:p>
     <w:p>
@@ -4045,7 +4292,7 @@
         <w:drawing>
           <wp:inline xmlns:a="http://schemas.openxmlformats.org/drawingml/2006/main" xmlns:pic="http://schemas.openxmlformats.org/drawingml/2006/picture">
             <wp:extent cx="5349240" cy="2302148"/>
-            <wp:docPr id="10" name="Picture 10"/>
+            <wp:docPr id="11" name="Picture 11"/>
             <wp:cNvGraphicFramePr>
               <a:graphicFrameLocks noChangeAspect="1"/>
             </wp:cNvGraphicFramePr>
@@ -4053,11 +4300,11 @@
               <a:graphicData uri="http://schemas.openxmlformats.org/drawingml/2006/picture">
                 <pic:pic>
                   <pic:nvPicPr>
-                    <pic:cNvPr id="0" name="fig10_cluster_profile_heatmap.png"/>
+                    <pic:cNvPr id="0" name="fig11_cluster_profile_heatmap.png"/>
                     <pic:cNvPicPr/>
                   </pic:nvPicPr>
                   <pic:blipFill>
-                    <a:blip r:embed="rId21"/>
+                    <a:blip r:embed="rId22"/>
                     <a:stretch>
                       <a:fillRect/>
                     </a:stretch>
@@ -4086,15 +4333,15 @@
           <w:b/>
           <w:sz w:val="22"/>
         </w:rPr>
-        <w:t>Fig10</w:t>
-      </w:r>
-      <w:r>
-        <w:rPr>
-          <w:rFonts w:ascii="Calibri" w:hAnsi="Calibri" w:eastAsia="Calibri"/>
-          <w:b w:val="0"/>
-          <w:sz w:val="22"/>
-        </w:rPr>
-        <w:t xml:space="preserve"> Cluster Profile Heatmap</w:t>
+        <w:t>Fig11</w:t>
+      </w:r>
+      <w:r>
+        <w:rPr>
+          <w:rFonts w:ascii="Calibri" w:hAnsi="Calibri" w:eastAsia="Calibri"/>
+          <w:b w:val="0"/>
+          <w:sz w:val="22"/>
+        </w:rPr>
+        <w:t xml:space="preserve"> Three Digital Lifestyle Cluster Profiles</w:t>
       </w:r>
     </w:p>
     <w:p>
@@ -4158,6 +4405,129 @@
           <w:sz w:val="22"/>
         </w:rPr>
         <w:t xml:space="preserve"> The heatmap makes the cluster names understandable even though the cluster boundaries are not strong.</w:t>
+      </w:r>
+    </w:p>
+    <w:p>
+      <w:pPr>
+        <w:jc w:val="center"/>
+      </w:pPr>
+      <w:r>
+        <w:drawing>
+          <wp:inline xmlns:a="http://schemas.openxmlformats.org/drawingml/2006/main" xmlns:pic="http://schemas.openxmlformats.org/drawingml/2006/picture">
+            <wp:extent cx="5349240" cy="3284296"/>
+            <wp:docPr id="12" name="Picture 12"/>
+            <wp:cNvGraphicFramePr>
+              <a:graphicFrameLocks noChangeAspect="1"/>
+            </wp:cNvGraphicFramePr>
+            <a:graphic>
+              <a:graphicData uri="http://schemas.openxmlformats.org/drawingml/2006/picture">
+                <pic:pic>
+                  <pic:nvPicPr>
+                    <pic:cNvPr id="0" name="fig12_pca_explained_variance.png"/>
+                    <pic:cNvPicPr/>
+                  </pic:nvPicPr>
+                  <pic:blipFill>
+                    <a:blip r:embed="rId23"/>
+                    <a:stretch>
+                      <a:fillRect/>
+                    </a:stretch>
+                  </pic:blipFill>
+                  <pic:spPr>
+                    <a:xfrm>
+                      <a:off x="0" y="0"/>
+                      <a:ext cx="5349240" cy="3284296"/>
+                    </a:xfrm>
+                    <a:prstGeom prst="rect"/>
+                  </pic:spPr>
+                </pic:pic>
+              </a:graphicData>
+            </a:graphic>
+          </wp:inline>
+        </w:drawing>
+      </w:r>
+    </w:p>
+    <w:p>
+      <w:pPr>
+        <w:spacing w:line="269" w:lineRule="auto" w:after="100"/>
+      </w:pPr>
+      <w:r>
+        <w:rPr>
+          <w:rFonts w:ascii="Calibri" w:hAnsi="Calibri" w:eastAsia="Calibri"/>
+          <w:b/>
+          <w:sz w:val="22"/>
+        </w:rPr>
+        <w:t>Fig12</w:t>
+      </w:r>
+      <w:r>
+        <w:rPr>
+          <w:rFonts w:ascii="Calibri" w:hAnsi="Calibri" w:eastAsia="Calibri"/>
+          <w:b w:val="0"/>
+          <w:sz w:val="22"/>
+        </w:rPr>
+        <w:t xml:space="preserve"> PCA Variance and Two-Dimensional Structure</w:t>
+      </w:r>
+    </w:p>
+    <w:p>
+      <w:pPr>
+        <w:spacing w:line="269" w:lineRule="auto" w:after="100"/>
+      </w:pPr>
+      <w:r>
+        <w:rPr>
+          <w:rFonts w:ascii="Calibri" w:hAnsi="Calibri" w:eastAsia="Calibri"/>
+          <w:b/>
+          <w:sz w:val="22"/>
+        </w:rPr>
+        <w:t>Purpose:</w:t>
+      </w:r>
+      <w:r>
+        <w:rPr>
+          <w:rFonts w:ascii="Calibri" w:hAnsi="Calibri" w:eastAsia="Calibri"/>
+          <w:b w:val="0"/>
+          <w:sz w:val="22"/>
+        </w:rPr>
+        <w:t xml:space="preserve"> This figure provides dimensionality-reduction evidence for the PCA extension used in preprocessing and clustering interpretation.</w:t>
+      </w:r>
+    </w:p>
+    <w:p>
+      <w:pPr>
+        <w:spacing w:line="269" w:lineRule="auto" w:after="100"/>
+      </w:pPr>
+      <w:r>
+        <w:rPr>
+          <w:rFonts w:ascii="Calibri" w:hAnsi="Calibri" w:eastAsia="Calibri"/>
+          <w:b/>
+          <w:sz w:val="22"/>
+        </w:rPr>
+        <w:t>Interpretation:</w:t>
+      </w:r>
+      <w:r>
+        <w:rPr>
+          <w:rFonts w:ascii="Calibri" w:hAnsi="Calibri" w:eastAsia="Calibri"/>
+          <w:b w:val="0"/>
+          <w:sz w:val="22"/>
+        </w:rPr>
+        <w:t xml:space="preserve"> The first two principal components explain about 42.41% of the total variance. Therefore, a two-dimensional view captures part of the structure but not the whole high-dimensional dataset.</w:t>
+      </w:r>
+    </w:p>
+    <w:p>
+      <w:pPr>
+        <w:spacing w:line="269" w:lineRule="auto" w:after="100"/>
+      </w:pPr>
+      <w:r>
+        <w:rPr>
+          <w:rFonts w:ascii="Calibri" w:hAnsi="Calibri" w:eastAsia="Calibri"/>
+          <w:b/>
+          <w:sz w:val="22"/>
+        </w:rPr>
+        <w:t>Conclusion:</w:t>
+      </w:r>
+      <w:r>
+        <w:rPr>
+          <w:rFonts w:ascii="Calibri" w:hAnsi="Calibri" w:eastAsia="Calibri"/>
+          <w:b w:val="0"/>
+          <w:sz w:val="22"/>
+        </w:rPr>
+        <w:t xml:space="preserve"> PCA is useful for auxiliary structure understanding, but it should not replace the original feature space for classification, regression, or final clustering evaluation.</w:t>
       </w:r>
     </w:p>
     <w:p>
@@ -4250,7 +4620,7 @@
           <w:color w:val="2E74B5"/>
           <w:sz w:val="25"/>
         </w:rPr>
-        <w:t>5.5 Result Analysis</w:t>
+        <w:t>5.5 Integrated Result Analysis</w:t>
       </w:r>
     </w:p>
     <w:p>
@@ -4282,7 +4652,7 @@
           <w:color w:val="1F4D78"/>
           <w:sz w:val="30"/>
         </w:rPr>
-        <w:t>6. Conclusion</w:t>
+        <w:t>6. Findings, Limitations, and Reflection</w:t>
       </w:r>
     </w:p>
     <w:p>
@@ -4349,7 +4719,7 @@
           <w:color w:val="2E74B5"/>
           <w:sz w:val="25"/>
         </w:rPr>
-        <w:t>6.2 Value</w:t>
+        <w:t>6.2 Practical Value</w:t>
       </w:r>
     </w:p>
     <w:p>
@@ -4455,7 +4825,7 @@
           <w:color w:val="2E74B5"/>
           <w:sz w:val="25"/>
         </w:rPr>
-        <w:t>6.4 Reflection</w:t>
+        <w:t>6.4 Personal Reflection</w:t>
       </w:r>
     </w:p>
     <w:p>

</xml_diff>

<commit_message>
Refine workflow report logic and table evidence
</commit_message>
<xml_diff>
--- a/期末考查报告_数字生活方式分析/final_submit/大数据分析与应用期末考查报告.docx
+++ b/期末考查报告_数字生活方式分析/final_submit/大数据分析与应用期末考查报告.docx
@@ -1061,7 +1061,20 @@
           <w:color w:val="2E74B5"/>
           <w:sz w:val="25"/>
         </w:rPr>
-        <w:t>2.2 Field Structure</w:t>
+        <w:t>2.2 Raw Data Evidence</w:t>
+      </w:r>
+    </w:p>
+    <w:p>
+      <w:pPr>
+        <w:spacing w:line="269" w:lineRule="auto" w:after="100"/>
+      </w:pPr>
+      <w:r>
+        <w:rPr>
+          <w:rFonts w:ascii="Calibri" w:hAnsi="Calibri" w:eastAsia="Calibri"/>
+          <w:b w:val="0"/>
+          <w:sz w:val="22"/>
+        </w:rPr>
+        <w:t>The raw data evidence is kept as an Excel screenshot file instead of a large Word table. This makes the report closer to a real analysis process: first inspect the original table, then clean it, transform it, visualize it, and finally model it.</w:t>
       </w:r>
     </w:p>
     <w:p>
@@ -1075,28 +1088,28 @@
           <w:color w:val="9B1C1C"/>
           <w:sz w:val="21"/>
         </w:rPr>
-        <w:t>[INSERT TABLE2 SCREENSHOT HERE: screenshot_tables/table2_dataset_fields.xlsx]</w:t>
-      </w:r>
-    </w:p>
-    <w:p>
-      <w:pPr>
-        <w:spacing w:line="269" w:lineRule="auto" w:after="100"/>
-      </w:pPr>
-      <w:r>
-        <w:rPr>
-          <w:rFonts w:ascii="Calibri" w:hAnsi="Calibri" w:eastAsia="Calibri"/>
-          <w:b/>
-          <w:sz w:val="22"/>
-        </w:rPr>
-        <w:t>Table2</w:t>
-      </w:r>
-      <w:r>
-        <w:rPr>
-          <w:rFonts w:ascii="Calibri" w:hAnsi="Calibri" w:eastAsia="Calibri"/>
-          <w:b w:val="0"/>
-          <w:sz w:val="22"/>
-        </w:rPr>
-        <w:t xml:space="preserve"> Dataset Fields</w:t>
+        <w:t>[INSERT TABLE1 SCREENSHOT HERE: screenshot_tables/table1_raw_dataset_preview.xlsx]</w:t>
+      </w:r>
+    </w:p>
+    <w:p>
+      <w:pPr>
+        <w:spacing w:line="269" w:lineRule="auto" w:after="100"/>
+      </w:pPr>
+      <w:r>
+        <w:rPr>
+          <w:rFonts w:ascii="Calibri" w:hAnsi="Calibri" w:eastAsia="Calibri"/>
+          <w:b/>
+          <w:sz w:val="22"/>
+        </w:rPr>
+        <w:t>Table1</w:t>
+      </w:r>
+      <w:r>
+        <w:rPr>
+          <w:rFonts w:ascii="Calibri" w:hAnsi="Calibri" w:eastAsia="Calibri"/>
+          <w:b w:val="0"/>
+          <w:sz w:val="22"/>
+        </w:rPr>
+        <w:t xml:space="preserve"> Raw Dataset Preview</w:t>
       </w:r>
     </w:p>
     <w:p>
@@ -1117,7 +1130,7 @@
           <w:b w:val="0"/>
           <w:sz w:val="22"/>
         </w:rPr>
-        <w:t xml:space="preserve"> This table screenshot explains the meaning and type of each field before analysis.</w:t>
+        <w:t xml:space="preserve"> This table screenshot shows the original CSV structure before preprocessing.</w:t>
       </w:r>
     </w:p>
     <w:p>
@@ -1138,7 +1151,7 @@
           <w:b w:val="0"/>
           <w:sz w:val="22"/>
         </w:rPr>
-        <w:t xml:space="preserve"> The dataset includes behavior variables, lifestyle variables, background variables, and target variables such as high_risk_flag, digital_dependence_score, and productivity_score.</w:t>
+        <w:t xml:space="preserve"> The raw dataset contains digital behavior variables, lifestyle variables, and target variables.</w:t>
       </w:r>
     </w:p>
     <w:p>
@@ -1159,7 +1172,7 @@
           <w:b w:val="0"/>
           <w:sz w:val="22"/>
         </w:rPr>
-        <w:t xml:space="preserve"> The field design is suitable for a full workflow because it provides both input features and several possible target variables.</w:t>
+        <w:t xml:space="preserve"> The raw data structure supports classification, regression, and clustering, so the dataset meets the multi-task requirement.</w:t>
       </w:r>
     </w:p>
     <w:p>
@@ -1173,20 +1186,105 @@
           <w:color w:val="2E74B5"/>
           <w:sz w:val="25"/>
         </w:rPr>
-        <w:t>2.3 Task Feasibility</w:t>
-      </w:r>
-    </w:p>
-    <w:p>
-      <w:pPr>
-        <w:spacing w:line="269" w:lineRule="auto" w:after="100"/>
-      </w:pPr>
-      <w:r>
-        <w:rPr>
-          <w:rFonts w:ascii="Calibri" w:hAnsi="Calibri" w:eastAsia="Calibri"/>
-          <w:b w:val="0"/>
-          <w:sz w:val="22"/>
-        </w:rPr>
-        <w:t>The dataset supports high_risk_flag classification, digital_dependence_score regression, productivity_score weak-prediction checking, and clustering based on behavior and lifestyle features. This is why it fits the final report better than a dataset that only supports one classification task.</w:t>
+        <w:t>2.3 Field Structure</w:t>
+      </w:r>
+    </w:p>
+    <w:p>
+      <w:pPr>
+        <w:spacing w:before="80" w:after="80"/>
+      </w:pPr>
+      <w:r>
+        <w:rPr>
+          <w:rFonts w:ascii="Consolas" w:hAnsi="Consolas" w:eastAsia="Consolas"/>
+          <w:b/>
+          <w:color w:val="9B1C1C"/>
+          <w:sz w:val="21"/>
+        </w:rPr>
+        <w:t>[INSERT TABLE2 SCREENSHOT HERE: screenshot_tables/table2_dataset_fields.xlsx]</w:t>
+      </w:r>
+    </w:p>
+    <w:p>
+      <w:pPr>
+        <w:spacing w:line="269" w:lineRule="auto" w:after="100"/>
+      </w:pPr>
+      <w:r>
+        <w:rPr>
+          <w:rFonts w:ascii="Calibri" w:hAnsi="Calibri" w:eastAsia="Calibri"/>
+          <w:b/>
+          <w:sz w:val="22"/>
+        </w:rPr>
+        <w:t>Table2</w:t>
+      </w:r>
+      <w:r>
+        <w:rPr>
+          <w:rFonts w:ascii="Calibri" w:hAnsi="Calibri" w:eastAsia="Calibri"/>
+          <w:b w:val="0"/>
+          <w:sz w:val="22"/>
+        </w:rPr>
+        <w:t xml:space="preserve"> Dataset Fields</w:t>
+      </w:r>
+    </w:p>
+    <w:p>
+      <w:pPr>
+        <w:spacing w:line="269" w:lineRule="auto" w:after="100"/>
+      </w:pPr>
+      <w:r>
+        <w:rPr>
+          <w:rFonts w:ascii="Calibri" w:hAnsi="Calibri" w:eastAsia="Calibri"/>
+          <w:b/>
+          <w:sz w:val="22"/>
+        </w:rPr>
+        <w:t>Purpose:</w:t>
+      </w:r>
+      <w:r>
+        <w:rPr>
+          <w:rFonts w:ascii="Calibri" w:hAnsi="Calibri" w:eastAsia="Calibri"/>
+          <w:b w:val="0"/>
+          <w:sz w:val="22"/>
+        </w:rPr>
+        <w:t xml:space="preserve"> This table screenshot explains the meaning and type of each field before analysis.</w:t>
+      </w:r>
+    </w:p>
+    <w:p>
+      <w:pPr>
+        <w:spacing w:line="269" w:lineRule="auto" w:after="100"/>
+      </w:pPr>
+      <w:r>
+        <w:rPr>
+          <w:rFonts w:ascii="Calibri" w:hAnsi="Calibri" w:eastAsia="Calibri"/>
+          <w:b/>
+          <w:sz w:val="22"/>
+        </w:rPr>
+        <w:t>Interpretation:</w:t>
+      </w:r>
+      <w:r>
+        <w:rPr>
+          <w:rFonts w:ascii="Calibri" w:hAnsi="Calibri" w:eastAsia="Calibri"/>
+          <w:b w:val="0"/>
+          <w:sz w:val="22"/>
+        </w:rPr>
+        <w:t xml:space="preserve"> The dataset includes behavior variables, lifestyle variables, background variables, and target variables such as high_risk_flag, digital_dependence_score, and productivity_score.</w:t>
+      </w:r>
+    </w:p>
+    <w:p>
+      <w:pPr>
+        <w:spacing w:line="269" w:lineRule="auto" w:after="100"/>
+      </w:pPr>
+      <w:r>
+        <w:rPr>
+          <w:rFonts w:ascii="Calibri" w:hAnsi="Calibri" w:eastAsia="Calibri"/>
+          <w:b/>
+          <w:sz w:val="22"/>
+        </w:rPr>
+        <w:t>Conclusion:</w:t>
+      </w:r>
+      <w:r>
+        <w:rPr>
+          <w:rFonts w:ascii="Calibri" w:hAnsi="Calibri" w:eastAsia="Calibri"/>
+          <w:b w:val="0"/>
+          <w:sz w:val="22"/>
+        </w:rPr>
+        <w:t xml:space="preserve"> The field design is suitable for a full workflow because it provides both input features and several possible target variables.</w:t>
       </w:r>
     </w:p>
     <w:p>
@@ -1200,20 +1298,20 @@
           <w:color w:val="2E74B5"/>
           <w:sz w:val="25"/>
         </w:rPr>
-        <w:t>2.4 Raw Data Evidence</w:t>
-      </w:r>
-    </w:p>
-    <w:p>
-      <w:pPr>
-        <w:spacing w:line="269" w:lineRule="auto" w:after="100"/>
-      </w:pPr>
-      <w:r>
-        <w:rPr>
-          <w:rFonts w:ascii="Calibri" w:hAnsi="Calibri" w:eastAsia="Calibri"/>
-          <w:b w:val="0"/>
-          <w:sz w:val="22"/>
-        </w:rPr>
-        <w:t>The raw data evidence is kept as an Excel screenshot file instead of a large Word table. This makes the report closer to a real analysis process: first inspect the original table, then clean it, transform it, visualize it, and finally model it.</w:t>
+        <w:t>2.4 Task Feasibility</w:t>
+      </w:r>
+    </w:p>
+    <w:p>
+      <w:pPr>
+        <w:spacing w:line="269" w:lineRule="auto" w:after="100"/>
+      </w:pPr>
+      <w:r>
+        <w:rPr>
+          <w:rFonts w:ascii="Calibri" w:hAnsi="Calibri" w:eastAsia="Calibri"/>
+          <w:b w:val="0"/>
+          <w:sz w:val="22"/>
+        </w:rPr>
+        <w:t>The dataset supports high_risk_flag classification, digital_dependence_score regression, productivity_score weak-prediction checking, and clustering based on behavior and lifestyle features. This is why it fits the final report better than a dataset that only supports one classification task.</w:t>
       </w:r>
     </w:p>
     <w:p>
@@ -1286,91 +1384,86 @@
           <w:color w:val="9B1C1C"/>
           <w:sz w:val="21"/>
         </w:rPr>
-        <w:t>[INSERT TABLE1 SCREENSHOT HERE: screenshot_tables/table1_raw_dataset_preview.xlsx]</w:t>
-      </w:r>
-    </w:p>
-    <w:p>
-      <w:pPr>
-        <w:spacing w:line="269" w:lineRule="auto" w:after="100"/>
-      </w:pPr>
-      <w:r>
-        <w:rPr>
-          <w:rFonts w:ascii="Calibri" w:hAnsi="Calibri" w:eastAsia="Calibri"/>
-          <w:b/>
-          <w:sz w:val="22"/>
-        </w:rPr>
-        <w:t>Table1</w:t>
-      </w:r>
-      <w:r>
-        <w:rPr>
-          <w:rFonts w:ascii="Calibri" w:hAnsi="Calibri" w:eastAsia="Calibri"/>
-          <w:b w:val="0"/>
-          <w:sz w:val="22"/>
-        </w:rPr>
-        <w:t xml:space="preserve"> Raw Dataset Preview</w:t>
-      </w:r>
-    </w:p>
-    <w:p>
-      <w:pPr>
-        <w:spacing w:line="269" w:lineRule="auto" w:after="100"/>
-      </w:pPr>
-      <w:r>
-        <w:rPr>
-          <w:rFonts w:ascii="Calibri" w:hAnsi="Calibri" w:eastAsia="Calibri"/>
-          <w:b/>
-          <w:sz w:val="22"/>
-        </w:rPr>
-        <w:t>Purpose:</w:t>
-      </w:r>
-      <w:r>
-        <w:rPr>
-          <w:rFonts w:ascii="Calibri" w:hAnsi="Calibri" w:eastAsia="Calibri"/>
-          <w:b w:val="0"/>
-          <w:sz w:val="22"/>
-        </w:rPr>
-        <w:t xml:space="preserve"> This table screenshot shows the original CSV structure before preprocessing.</w:t>
-      </w:r>
-    </w:p>
-    <w:p>
-      <w:pPr>
-        <w:spacing w:line="269" w:lineRule="auto" w:after="100"/>
-      </w:pPr>
-      <w:r>
-        <w:rPr>
-          <w:rFonts w:ascii="Calibri" w:hAnsi="Calibri" w:eastAsia="Calibri"/>
-          <w:b/>
-          <w:sz w:val="22"/>
-        </w:rPr>
-        <w:t>Interpretation:</w:t>
-      </w:r>
-      <w:r>
-        <w:rPr>
-          <w:rFonts w:ascii="Calibri" w:hAnsi="Calibri" w:eastAsia="Calibri"/>
-          <w:b w:val="0"/>
-          <w:sz w:val="22"/>
-        </w:rPr>
-        <w:t xml:space="preserve"> The raw dataset contains digital behavior variables, lifestyle variables, and target variables.</w:t>
-      </w:r>
-    </w:p>
-    <w:p>
-      <w:pPr>
-        <w:spacing w:line="269" w:lineRule="auto" w:after="100"/>
-      </w:pPr>
-      <w:r>
-        <w:rPr>
-          <w:rFonts w:ascii="Calibri" w:hAnsi="Calibri" w:eastAsia="Calibri"/>
-          <w:b/>
-          <w:sz w:val="22"/>
-        </w:rPr>
-        <w:t>Conclusion:</w:t>
-      </w:r>
-      <w:r>
-        <w:rPr>
-          <w:rFonts w:ascii="Calibri" w:hAnsi="Calibri" w:eastAsia="Calibri"/>
-          <w:b w:val="0"/>
-          <w:sz w:val="22"/>
-        </w:rPr>
-        <w:t xml:space="preserve"> The raw data structure supports classification, regression, and clustering, so the dataset meets the multi-task requirement.</w:t>
+        <w:t>[PASTE CODE1 HERE FROM report_code_snippets.md: Code1 Data Loading and Basic Inspection]</w:t>
+      </w:r>
+    </w:p>
+    <w:p>
+      <w:pPr>
+        <w:spacing w:line="269" w:lineRule="auto" w:after="100"/>
+      </w:pPr>
+      <w:r>
+        <w:rPr>
+          <w:rFonts w:ascii="Calibri" w:hAnsi="Calibri" w:eastAsia="Calibri"/>
+          <w:b w:val="0"/>
+          <w:sz w:val="22"/>
+        </w:rPr>
+        <w:t>Explanation: This code is used to load the CSV file and inspect its shape, columns, dtypes, and first rows.</w:t>
+      </w:r>
+    </w:p>
+    <w:p>
+      <w:pPr>
+        <w:spacing w:line="269" w:lineRule="auto" w:after="100"/>
+      </w:pPr>
+      <w:r>
+        <w:rPr>
+          <w:rFonts w:ascii="Calibri" w:hAnsi="Calibri" w:eastAsia="Calibri"/>
+          <w:b w:val="0"/>
+          <w:sz w:val="22"/>
+        </w:rPr>
+        <w:t>It is necessary because the analysis should start from the raw table instead of assuming the data is already correct.</w:t>
+      </w:r>
+    </w:p>
+    <w:p>
+      <w:pPr>
+        <w:spacing w:line="269" w:lineRule="auto" w:after="100"/>
+      </w:pPr>
+      <w:r>
+        <w:rPr>
+          <w:rFonts w:ascii="Calibri" w:hAnsi="Calibri" w:eastAsia="Calibri"/>
+          <w:b w:val="0"/>
+          <w:sz w:val="22"/>
+        </w:rPr>
+        <w:t>The output is the dataset shape, column list, data types, and preview rows.</w:t>
+      </w:r>
+    </w:p>
+    <w:p>
+      <w:pPr>
+        <w:spacing w:line="269" w:lineRule="auto" w:after="100"/>
+      </w:pPr>
+      <w:r>
+        <w:rPr>
+          <w:rFonts w:ascii="Calibri" w:hAnsi="Calibri" w:eastAsia="Calibri"/>
+          <w:b w:val="0"/>
+          <w:sz w:val="22"/>
+        </w:rPr>
+        <w:t>This result supports the dataset introduction and later preprocessing steps.</w:t>
+      </w:r>
+    </w:p>
+    <w:p>
+      <w:pPr>
+        <w:pStyle w:val="2"/>
+      </w:pPr>
+      <w:r>
+        <w:rPr>
+          <w:rFonts w:ascii="Calibri" w:hAnsi="Calibri" w:eastAsia="Calibri"/>
+          <w:b/>
+          <w:color w:val="2E74B5"/>
+          <w:sz w:val="25"/>
+        </w:rPr>
+        <w:t>3.2 Missing and Duplicate Check</w:t>
+      </w:r>
+    </w:p>
+    <w:p>
+      <w:pPr>
+        <w:spacing w:line="269" w:lineRule="auto" w:after="100"/>
+      </w:pPr>
+      <w:r>
+        <w:rPr>
+          <w:rFonts w:ascii="Calibri" w:hAnsi="Calibri" w:eastAsia="Calibri"/>
+          <w:b w:val="0"/>
+          <w:sz w:val="22"/>
+        </w:rPr>
+        <w:t>This step checks missing values and duplicate records. The current result is missing values = 0, duplicate rows = 0, and duplicate id = 0.</w:t>
       </w:r>
     </w:p>
     <w:p>
@@ -1384,59 +1477,255 @@
           <w:color w:val="9B1C1C"/>
           <w:sz w:val="21"/>
         </w:rPr>
-        <w:t>[PASTE CODE1 HERE FROM report_code_snippets.md: Code1 Data Loading and Basic Inspection]</w:t>
-      </w:r>
-    </w:p>
-    <w:p>
-      <w:pPr>
-        <w:spacing w:line="269" w:lineRule="auto" w:after="100"/>
-      </w:pPr>
-      <w:r>
-        <w:rPr>
-          <w:rFonts w:ascii="Calibri" w:hAnsi="Calibri" w:eastAsia="Calibri"/>
-          <w:b w:val="0"/>
-          <w:sz w:val="22"/>
-        </w:rPr>
-        <w:t>Explanation: This code is used to load the CSV file and inspect its shape, columns, dtypes, and first rows.</w:t>
-      </w:r>
-    </w:p>
-    <w:p>
-      <w:pPr>
-        <w:spacing w:line="269" w:lineRule="auto" w:after="100"/>
-      </w:pPr>
-      <w:r>
-        <w:rPr>
-          <w:rFonts w:ascii="Calibri" w:hAnsi="Calibri" w:eastAsia="Calibri"/>
-          <w:b w:val="0"/>
-          <w:sz w:val="22"/>
-        </w:rPr>
-        <w:t>It is necessary because the analysis should start from the raw table instead of assuming the data is already correct.</w:t>
-      </w:r>
-    </w:p>
-    <w:p>
-      <w:pPr>
-        <w:spacing w:line="269" w:lineRule="auto" w:after="100"/>
-      </w:pPr>
-      <w:r>
-        <w:rPr>
-          <w:rFonts w:ascii="Calibri" w:hAnsi="Calibri" w:eastAsia="Calibri"/>
-          <w:b w:val="0"/>
-          <w:sz w:val="22"/>
-        </w:rPr>
-        <w:t>The output is the dataset shape, column list, data types, and preview rows.</w:t>
-      </w:r>
-    </w:p>
-    <w:p>
-      <w:pPr>
-        <w:spacing w:line="269" w:lineRule="auto" w:after="100"/>
-      </w:pPr>
-      <w:r>
-        <w:rPr>
-          <w:rFonts w:ascii="Calibri" w:hAnsi="Calibri" w:eastAsia="Calibri"/>
-          <w:b w:val="0"/>
-          <w:sz w:val="22"/>
-        </w:rPr>
-        <w:t>This result supports the dataset introduction and later preprocessing steps.</w:t>
+        <w:t>[INSERT TABLE3 SCREENSHOT HERE: screenshot_tables/table3_missing_value_check.xlsx]</w:t>
+      </w:r>
+    </w:p>
+    <w:p>
+      <w:pPr>
+        <w:spacing w:line="269" w:lineRule="auto" w:after="100"/>
+      </w:pPr>
+      <w:r>
+        <w:rPr>
+          <w:rFonts w:ascii="Calibri" w:hAnsi="Calibri" w:eastAsia="Calibri"/>
+          <w:b/>
+          <w:sz w:val="22"/>
+        </w:rPr>
+        <w:t>Table3</w:t>
+      </w:r>
+      <w:r>
+        <w:rPr>
+          <w:rFonts w:ascii="Calibri" w:hAnsi="Calibri" w:eastAsia="Calibri"/>
+          <w:b w:val="0"/>
+          <w:sz w:val="22"/>
+        </w:rPr>
+        <w:t xml:space="preserve"> Missing Value Check</w:t>
+      </w:r>
+    </w:p>
+    <w:p>
+      <w:pPr>
+        <w:spacing w:line="269" w:lineRule="auto" w:after="100"/>
+      </w:pPr>
+      <w:r>
+        <w:rPr>
+          <w:rFonts w:ascii="Calibri" w:hAnsi="Calibri" w:eastAsia="Calibri"/>
+          <w:b/>
+          <w:sz w:val="22"/>
+        </w:rPr>
+        <w:t>Purpose:</w:t>
+      </w:r>
+      <w:r>
+        <w:rPr>
+          <w:rFonts w:ascii="Calibri" w:hAnsi="Calibri" w:eastAsia="Calibri"/>
+          <w:b w:val="0"/>
+          <w:sz w:val="22"/>
+        </w:rPr>
+        <w:t xml:space="preserve"> This screenshot records missing counts and missing rates for all fields.</w:t>
+      </w:r>
+    </w:p>
+    <w:p>
+      <w:pPr>
+        <w:spacing w:line="269" w:lineRule="auto" w:after="100"/>
+      </w:pPr>
+      <w:r>
+        <w:rPr>
+          <w:rFonts w:ascii="Calibri" w:hAnsi="Calibri" w:eastAsia="Calibri"/>
+          <w:b/>
+          <w:sz w:val="22"/>
+        </w:rPr>
+        <w:t>Interpretation:</w:t>
+      </w:r>
+      <w:r>
+        <w:rPr>
+          <w:rFonts w:ascii="Calibri" w:hAnsi="Calibri" w:eastAsia="Calibri"/>
+          <w:b w:val="0"/>
+          <w:sz w:val="22"/>
+        </w:rPr>
+        <w:t xml:space="preserve"> Every field has zero missing values, so no row has to be removed for missing data.</w:t>
+      </w:r>
+    </w:p>
+    <w:p>
+      <w:pPr>
+        <w:spacing w:line="269" w:lineRule="auto" w:after="100"/>
+      </w:pPr>
+      <w:r>
+        <w:rPr>
+          <w:rFonts w:ascii="Calibri" w:hAnsi="Calibri" w:eastAsia="Calibri"/>
+          <w:b/>
+          <w:sz w:val="22"/>
+        </w:rPr>
+        <w:t>Conclusion:</w:t>
+      </w:r>
+      <w:r>
+        <w:rPr>
+          <w:rFonts w:ascii="Calibri" w:hAnsi="Calibri" w:eastAsia="Calibri"/>
+          <w:b w:val="0"/>
+          <w:sz w:val="22"/>
+        </w:rPr>
+        <w:t xml:space="preserve"> The clean missing-value result allows the modeling pipeline to focus on feature selection and evaluation.</w:t>
+      </w:r>
+    </w:p>
+    <w:p>
+      <w:pPr>
+        <w:spacing w:before="80" w:after="80"/>
+      </w:pPr>
+      <w:r>
+        <w:rPr>
+          <w:rFonts w:ascii="Consolas" w:hAnsi="Consolas" w:eastAsia="Consolas"/>
+          <w:b/>
+          <w:color w:val="9B1C1C"/>
+          <w:sz w:val="21"/>
+        </w:rPr>
+        <w:t>[INSERT TABLE4 SCREENSHOT HERE: screenshot_tables/table4_duplicate_check.xlsx]</w:t>
+      </w:r>
+    </w:p>
+    <w:p>
+      <w:pPr>
+        <w:spacing w:line="269" w:lineRule="auto" w:after="100"/>
+      </w:pPr>
+      <w:r>
+        <w:rPr>
+          <w:rFonts w:ascii="Calibri" w:hAnsi="Calibri" w:eastAsia="Calibri"/>
+          <w:b/>
+          <w:sz w:val="22"/>
+        </w:rPr>
+        <w:t>Table4</w:t>
+      </w:r>
+      <w:r>
+        <w:rPr>
+          <w:rFonts w:ascii="Calibri" w:hAnsi="Calibri" w:eastAsia="Calibri"/>
+          <w:b w:val="0"/>
+          <w:sz w:val="22"/>
+        </w:rPr>
+        <w:t xml:space="preserve"> Duplicate Check</w:t>
+      </w:r>
+    </w:p>
+    <w:p>
+      <w:pPr>
+        <w:spacing w:line="269" w:lineRule="auto" w:after="100"/>
+      </w:pPr>
+      <w:r>
+        <w:rPr>
+          <w:rFonts w:ascii="Calibri" w:hAnsi="Calibri" w:eastAsia="Calibri"/>
+          <w:b/>
+          <w:sz w:val="22"/>
+        </w:rPr>
+        <w:t>Purpose:</w:t>
+      </w:r>
+      <w:r>
+        <w:rPr>
+          <w:rFonts w:ascii="Calibri" w:hAnsi="Calibri" w:eastAsia="Calibri"/>
+          <w:b w:val="0"/>
+          <w:sz w:val="22"/>
+        </w:rPr>
+        <w:t xml:space="preserve"> This screenshot checks whether repeated rows or repeated ids exist.</w:t>
+      </w:r>
+    </w:p>
+    <w:p>
+      <w:pPr>
+        <w:spacing w:line="269" w:lineRule="auto" w:after="100"/>
+      </w:pPr>
+      <w:r>
+        <w:rPr>
+          <w:rFonts w:ascii="Calibri" w:hAnsi="Calibri" w:eastAsia="Calibri"/>
+          <w:b/>
+          <w:sz w:val="22"/>
+        </w:rPr>
+        <w:t>Interpretation:</w:t>
+      </w:r>
+      <w:r>
+        <w:rPr>
+          <w:rFonts w:ascii="Calibri" w:hAnsi="Calibri" w:eastAsia="Calibri"/>
+          <w:b w:val="0"/>
+          <w:sz w:val="22"/>
+        </w:rPr>
+        <w:t xml:space="preserve"> The duplicate row count and duplicate id count are both 0.</w:t>
+      </w:r>
+    </w:p>
+    <w:p>
+      <w:pPr>
+        <w:spacing w:line="269" w:lineRule="auto" w:after="100"/>
+      </w:pPr>
+      <w:r>
+        <w:rPr>
+          <w:rFonts w:ascii="Calibri" w:hAnsi="Calibri" w:eastAsia="Calibri"/>
+          <w:b/>
+          <w:sz w:val="22"/>
+        </w:rPr>
+        <w:t>Conclusion:</w:t>
+      </w:r>
+      <w:r>
+        <w:rPr>
+          <w:rFonts w:ascii="Calibri" w:hAnsi="Calibri" w:eastAsia="Calibri"/>
+          <w:b w:val="0"/>
+          <w:sz w:val="22"/>
+        </w:rPr>
+        <w:t xml:space="preserve"> Because the duplicate check passes, the full 3500 records are kept for the following analysis.</w:t>
+      </w:r>
+    </w:p>
+    <w:p>
+      <w:pPr>
+        <w:spacing w:before="80" w:after="80"/>
+      </w:pPr>
+      <w:r>
+        <w:rPr>
+          <w:rFonts w:ascii="Consolas" w:hAnsi="Consolas" w:eastAsia="Consolas"/>
+          <w:b/>
+          <w:color w:val="9B1C1C"/>
+          <w:sz w:val="21"/>
+        </w:rPr>
+        <w:t>[PASTE CODE2 HERE FROM report_code_snippets.md: Code2 Missing, Duplicate, and Range Check]</w:t>
+      </w:r>
+    </w:p>
+    <w:p>
+      <w:pPr>
+        <w:spacing w:line="269" w:lineRule="auto" w:after="100"/>
+      </w:pPr>
+      <w:r>
+        <w:rPr>
+          <w:rFonts w:ascii="Calibri" w:hAnsi="Calibri" w:eastAsia="Calibri"/>
+          <w:b w:val="0"/>
+          <w:sz w:val="22"/>
+        </w:rPr>
+        <w:t>Explanation: This code is used to calculate missing values, duplicated rows, duplicated ids, and basic numeric ranges.</w:t>
+      </w:r>
+    </w:p>
+    <w:p>
+      <w:pPr>
+        <w:spacing w:line="269" w:lineRule="auto" w:after="100"/>
+      </w:pPr>
+      <w:r>
+        <w:rPr>
+          <w:rFonts w:ascii="Calibri" w:hAnsi="Calibri" w:eastAsia="Calibri"/>
+          <w:b w:val="0"/>
+          <w:sz w:val="22"/>
+        </w:rPr>
+        <w:t>It is necessary because data quality problems can distort visualizations and model evaluation.</w:t>
+      </w:r>
+    </w:p>
+    <w:p>
+      <w:pPr>
+        <w:spacing w:line="269" w:lineRule="auto" w:after="100"/>
+      </w:pPr>
+      <w:r>
+        <w:rPr>
+          <w:rFonts w:ascii="Calibri" w:hAnsi="Calibri" w:eastAsia="Calibri"/>
+          <w:b w:val="0"/>
+          <w:sz w:val="22"/>
+        </w:rPr>
+        <w:t>The output is a missing-value table, duplicate counts, and numeric min/max summaries.</w:t>
+      </w:r>
+    </w:p>
+    <w:p>
+      <w:pPr>
+        <w:spacing w:line="269" w:lineRule="auto" w:after="100"/>
+      </w:pPr>
+      <w:r>
+        <w:rPr>
+          <w:rFonts w:ascii="Calibri" w:hAnsi="Calibri" w:eastAsia="Calibri"/>
+          <w:b w:val="0"/>
+          <w:sz w:val="22"/>
+        </w:rPr>
+        <w:t>This result supports the decision to keep all records and continue to feature engineering.</w:t>
       </w:r>
     </w:p>
     <w:p>
@@ -1450,20 +1739,20 @@
           <w:color w:val="2E74B5"/>
           <w:sz w:val="25"/>
         </w:rPr>
-        <w:t>3.2 Missing and Duplicate Check</w:t>
-      </w:r>
-    </w:p>
-    <w:p>
-      <w:pPr>
-        <w:spacing w:line="269" w:lineRule="auto" w:after="100"/>
-      </w:pPr>
-      <w:r>
-        <w:rPr>
-          <w:rFonts w:ascii="Calibri" w:hAnsi="Calibri" w:eastAsia="Calibri"/>
-          <w:b w:val="0"/>
-          <w:sz w:val="22"/>
-        </w:rPr>
-        <w:t>This step checks missing values and duplicate records. The current result is missing values = 0, duplicate rows = 0, and duplicate id = 0.</w:t>
+        <w:t>3.3 Range and Rationality Check</w:t>
+      </w:r>
+    </w:p>
+    <w:p>
+      <w:pPr>
+        <w:spacing w:line="269" w:lineRule="auto" w:after="100"/>
+      </w:pPr>
+      <w:r>
+        <w:rPr>
+          <w:rFonts w:ascii="Calibri" w:hAnsi="Calibri" w:eastAsia="Calibri"/>
+          <w:b w:val="0"/>
+          <w:sz w:val="22"/>
+        </w:rPr>
+        <w:t>The range check covers age, device_hours_per_day, phone_unlocks, notifications_per_day, social_media_mins, study_mins, sleep_hours, sleep_quality, productivity_score, and digital_dependence_score. The goal is not to make the data look perfect. The goal is to check whether the numbers are reasonable for this benchmark dataset.</w:t>
       </w:r>
     </w:p>
     <w:p>
@@ -1477,28 +1766,28 @@
           <w:color w:val="9B1C1C"/>
           <w:sz w:val="21"/>
         </w:rPr>
-        <w:t>[INSERT TABLE3 SCREENSHOT HERE: screenshot_tables/table3_missing_value_check.xlsx]</w:t>
-      </w:r>
-    </w:p>
-    <w:p>
-      <w:pPr>
-        <w:spacing w:line="269" w:lineRule="auto" w:after="100"/>
-      </w:pPr>
-      <w:r>
-        <w:rPr>
-          <w:rFonts w:ascii="Calibri" w:hAnsi="Calibri" w:eastAsia="Calibri"/>
-          <w:b/>
-          <w:sz w:val="22"/>
-        </w:rPr>
-        <w:t>Table3</w:t>
-      </w:r>
-      <w:r>
-        <w:rPr>
-          <w:rFonts w:ascii="Calibri" w:hAnsi="Calibri" w:eastAsia="Calibri"/>
-          <w:b w:val="0"/>
-          <w:sz w:val="22"/>
-        </w:rPr>
-        <w:t xml:space="preserve"> Missing Value Check</w:t>
+        <w:t>[INSERT TABLE5 SCREENSHOT HERE: screenshot_tables/table5_range_and_rationality_check.xlsx]</w:t>
+      </w:r>
+    </w:p>
+    <w:p>
+      <w:pPr>
+        <w:spacing w:line="269" w:lineRule="auto" w:after="100"/>
+      </w:pPr>
+      <w:r>
+        <w:rPr>
+          <w:rFonts w:ascii="Calibri" w:hAnsi="Calibri" w:eastAsia="Calibri"/>
+          <w:b/>
+          <w:sz w:val="22"/>
+        </w:rPr>
+        <w:t>Table5</w:t>
+      </w:r>
+      <w:r>
+        <w:rPr>
+          <w:rFonts w:ascii="Calibri" w:hAnsi="Calibri" w:eastAsia="Calibri"/>
+          <w:b w:val="0"/>
+          <w:sz w:val="22"/>
+        </w:rPr>
+        <w:t xml:space="preserve"> Range and Rationality Check</w:t>
       </w:r>
     </w:p>
     <w:p>
@@ -1519,7 +1808,7 @@
           <w:b w:val="0"/>
           <w:sz w:val="22"/>
         </w:rPr>
-        <w:t xml:space="preserve"> This screenshot records missing counts and missing rates for all fields.</w:t>
+        <w:t xml:space="preserve"> This screenshot shows min, max, mean, reasonable range, and pass status for key numerical fields.</w:t>
       </w:r>
     </w:p>
     <w:p>
@@ -1540,7 +1829,7 @@
           <w:b w:val="0"/>
           <w:sz w:val="22"/>
         </w:rPr>
-        <w:t xml:space="preserve"> Every field has zero missing values, so no row has to be removed for missing data.</w:t>
+        <w:t xml:space="preserve"> The checked variables stay inside the expected ranges, so no serious abnormal record is removed.</w:t>
       </w:r>
     </w:p>
     <w:p>
@@ -1561,7 +1850,34 @@
           <w:b w:val="0"/>
           <w:sz w:val="22"/>
         </w:rPr>
-        <w:t xml:space="preserve"> The clean missing-value result allows the modeling pipeline to focus on feature selection and evaluation.</w:t>
+        <w:t xml:space="preserve"> The range check supports later statistical analysis because the main numerical fields are usable.</w:t>
+      </w:r>
+    </w:p>
+    <w:p>
+      <w:pPr>
+        <w:pStyle w:val="2"/>
+      </w:pPr>
+      <w:r>
+        <w:rPr>
+          <w:rFonts w:ascii="Calibri" w:hAnsi="Calibri" w:eastAsia="Calibri"/>
+          <w:b/>
+          <w:color w:val="2E74B5"/>
+          <w:sz w:val="25"/>
+        </w:rPr>
+        <w:t>3.4 Feature Engineering</w:t>
+      </w:r>
+    </w:p>
+    <w:p>
+      <w:pPr>
+        <w:spacing w:line="269" w:lineRule="auto" w:after="100"/>
+      </w:pPr>
+      <w:r>
+        <w:rPr>
+          <w:rFonts w:ascii="Calibri" w:hAnsi="Calibri" w:eastAsia="Calibri"/>
+          <w:b w:val="0"/>
+          <w:sz w:val="22"/>
+        </w:rPr>
+        <w:t>Feature engineering extracts behavior ratios and interaction information from the original columns. The new features are social_media_hours, study_hours, notifications_per_device_hour, unlocks_per_device_hour, device_to_sleep_ratio, activity_sleep_interaction, and social_to_study_ratio.</w:t>
       </w:r>
     </w:p>
     <w:p>
@@ -1575,28 +1891,28 @@
           <w:color w:val="9B1C1C"/>
           <w:sz w:val="21"/>
         </w:rPr>
-        <w:t>[INSERT TABLE4 SCREENSHOT HERE: screenshot_tables/table4_duplicate_check.xlsx]</w:t>
-      </w:r>
-    </w:p>
-    <w:p>
-      <w:pPr>
-        <w:spacing w:line="269" w:lineRule="auto" w:after="100"/>
-      </w:pPr>
-      <w:r>
-        <w:rPr>
-          <w:rFonts w:ascii="Calibri" w:hAnsi="Calibri" w:eastAsia="Calibri"/>
-          <w:b/>
-          <w:sz w:val="22"/>
-        </w:rPr>
-        <w:t>Table4</w:t>
-      </w:r>
-      <w:r>
-        <w:rPr>
-          <w:rFonts w:ascii="Calibri" w:hAnsi="Calibri" w:eastAsia="Calibri"/>
-          <w:b w:val="0"/>
-          <w:sz w:val="22"/>
-        </w:rPr>
-        <w:t xml:space="preserve"> Duplicate Check</w:t>
+        <w:t>[INSERT TABLE6 SCREENSHOT HERE: screenshot_tables/table6_engineered_features_preview.xlsx]</w:t>
+      </w:r>
+    </w:p>
+    <w:p>
+      <w:pPr>
+        <w:spacing w:line="269" w:lineRule="auto" w:after="100"/>
+      </w:pPr>
+      <w:r>
+        <w:rPr>
+          <w:rFonts w:ascii="Calibri" w:hAnsi="Calibri" w:eastAsia="Calibri"/>
+          <w:b/>
+          <w:sz w:val="22"/>
+        </w:rPr>
+        <w:t>Table6</w:t>
+      </w:r>
+      <w:r>
+        <w:rPr>
+          <w:rFonts w:ascii="Calibri" w:hAnsi="Calibri" w:eastAsia="Calibri"/>
+          <w:b w:val="0"/>
+          <w:sz w:val="22"/>
+        </w:rPr>
+        <w:t xml:space="preserve"> Engineered Features Preview</w:t>
       </w:r>
     </w:p>
     <w:p>
@@ -1617,7 +1933,7 @@
           <w:b w:val="0"/>
           <w:sz w:val="22"/>
         </w:rPr>
-        <w:t xml:space="preserve"> This screenshot checks whether repeated rows or repeated ids exist.</w:t>
+        <w:t xml:space="preserve"> This screenshot shows the engineered features beside key original behavior variables.</w:t>
       </w:r>
     </w:p>
     <w:p>
@@ -1638,7 +1954,7 @@
           <w:b w:val="0"/>
           <w:sz w:val="22"/>
         </w:rPr>
-        <w:t xml:space="preserve"> The duplicate row count and duplicate id count are both 0.</w:t>
+        <w:t xml:space="preserve"> The new features transform raw minutes and counts into more interpretable ratios and interaction terms.</w:t>
       </w:r>
     </w:p>
     <w:p>
@@ -1659,7 +1975,7 @@
           <w:b w:val="0"/>
           <w:sz w:val="22"/>
         </w:rPr>
-        <w:t xml:space="preserve"> Because the duplicate check passes, the full 3500 records are kept for the following analysis.</w:t>
+        <w:t xml:space="preserve"> These features help classification, regression, and clustering use behavior intensity rather than only raw counts.</w:t>
       </w:r>
     </w:p>
     <w:p>
@@ -1673,59 +1989,59 @@
           <w:color w:val="9B1C1C"/>
           <w:sz w:val="21"/>
         </w:rPr>
-        <w:t>[PASTE CODE2 HERE FROM report_code_snippets.md: Code2 Missing, Duplicate, and Range Check]</w:t>
-      </w:r>
-    </w:p>
-    <w:p>
-      <w:pPr>
-        <w:spacing w:line="269" w:lineRule="auto" w:after="100"/>
-      </w:pPr>
-      <w:r>
-        <w:rPr>
-          <w:rFonts w:ascii="Calibri" w:hAnsi="Calibri" w:eastAsia="Calibri"/>
-          <w:b w:val="0"/>
-          <w:sz w:val="22"/>
-        </w:rPr>
-        <w:t>Explanation: This code is used to calculate missing values, duplicated rows, duplicated ids, and basic numeric ranges.</w:t>
-      </w:r>
-    </w:p>
-    <w:p>
-      <w:pPr>
-        <w:spacing w:line="269" w:lineRule="auto" w:after="100"/>
-      </w:pPr>
-      <w:r>
-        <w:rPr>
-          <w:rFonts w:ascii="Calibri" w:hAnsi="Calibri" w:eastAsia="Calibri"/>
-          <w:b w:val="0"/>
-          <w:sz w:val="22"/>
-        </w:rPr>
-        <w:t>It is necessary because data quality problems can distort visualizations and model evaluation.</w:t>
-      </w:r>
-    </w:p>
-    <w:p>
-      <w:pPr>
-        <w:spacing w:line="269" w:lineRule="auto" w:after="100"/>
-      </w:pPr>
-      <w:r>
-        <w:rPr>
-          <w:rFonts w:ascii="Calibri" w:hAnsi="Calibri" w:eastAsia="Calibri"/>
-          <w:b w:val="0"/>
-          <w:sz w:val="22"/>
-        </w:rPr>
-        <w:t>The output is a missing-value table, duplicate counts, and numeric min/max summaries.</w:t>
-      </w:r>
-    </w:p>
-    <w:p>
-      <w:pPr>
-        <w:spacing w:line="269" w:lineRule="auto" w:after="100"/>
-      </w:pPr>
-      <w:r>
-        <w:rPr>
-          <w:rFonts w:ascii="Calibri" w:hAnsi="Calibri" w:eastAsia="Calibri"/>
-          <w:b w:val="0"/>
-          <w:sz w:val="22"/>
-        </w:rPr>
-        <w:t>This result supports the decision to keep all records and continue to feature engineering.</w:t>
+        <w:t>[PASTE CODE3 HERE FROM report_code_snippets.md: Code3 Feature Engineering]</w:t>
+      </w:r>
+    </w:p>
+    <w:p>
+      <w:pPr>
+        <w:spacing w:line="269" w:lineRule="auto" w:after="100"/>
+      </w:pPr>
+      <w:r>
+        <w:rPr>
+          <w:rFonts w:ascii="Calibri" w:hAnsi="Calibri" w:eastAsia="Calibri"/>
+          <w:b w:val="0"/>
+          <w:sz w:val="22"/>
+        </w:rPr>
+        <w:t>Explanation: This code is used to create behavior-hour, ratio, and interaction features from the raw columns.</w:t>
+      </w:r>
+    </w:p>
+    <w:p>
+      <w:pPr>
+        <w:spacing w:line="269" w:lineRule="auto" w:after="100"/>
+      </w:pPr>
+      <w:r>
+        <w:rPr>
+          <w:rFonts w:ascii="Calibri" w:hAnsi="Calibri" w:eastAsia="Calibri"/>
+          <w:b w:val="0"/>
+          <w:sz w:val="22"/>
+        </w:rPr>
+        <w:t>It is necessary because raw variables such as minutes and counts do not always describe intensity directly.</w:t>
+      </w:r>
+    </w:p>
+    <w:p>
+      <w:pPr>
+        <w:spacing w:line="269" w:lineRule="auto" w:after="100"/>
+      </w:pPr>
+      <w:r>
+        <w:rPr>
+          <w:rFonts w:ascii="Calibri" w:hAnsi="Calibri" w:eastAsia="Calibri"/>
+          <w:b w:val="0"/>
+          <w:sz w:val="22"/>
+        </w:rPr>
+        <w:t>The output is seven engineered features added to the processed dataset.</w:t>
+      </w:r>
+    </w:p>
+    <w:p>
+      <w:pPr>
+        <w:spacing w:line="269" w:lineRule="auto" w:after="100"/>
+      </w:pPr>
+      <w:r>
+        <w:rPr>
+          <w:rFonts w:ascii="Calibri" w:hAnsi="Calibri" w:eastAsia="Calibri"/>
+          <w:b w:val="0"/>
+          <w:sz w:val="22"/>
+        </w:rPr>
+        <w:t>This result supports later modeling and clustering by adding behavior-density information.</w:t>
       </w:r>
     </w:p>
     <w:p>
@@ -1739,20 +2055,20 @@
           <w:color w:val="2E74B5"/>
           <w:sz w:val="25"/>
         </w:rPr>
-        <w:t>3.3 Range and Rationality Check</w:t>
-      </w:r>
-    </w:p>
-    <w:p>
-      <w:pPr>
-        <w:spacing w:line="269" w:lineRule="auto" w:after="100"/>
-      </w:pPr>
-      <w:r>
-        <w:rPr>
-          <w:rFonts w:ascii="Calibri" w:hAnsi="Calibri" w:eastAsia="Calibri"/>
-          <w:b w:val="0"/>
-          <w:sz w:val="22"/>
-        </w:rPr>
-        <w:t>The range check covers age, device_hours_per_day, phone_unlocks, notifications_per_day, social_media_mins, study_mins, sleep_hours, sleep_quality, productivity_score, and digital_dependence_score. The goal is not to make the data look perfect. The goal is to check whether the numbers are reasonable for this benchmark dataset.</w:t>
+        <w:t>3.5 Feature Selection and Leakage Control</w:t>
+      </w:r>
+    </w:p>
+    <w:p>
+      <w:pPr>
+        <w:spacing w:line="269" w:lineRule="auto" w:after="100"/>
+      </w:pPr>
+      <w:r>
+        <w:rPr>
+          <w:rFonts w:ascii="Calibri" w:hAnsi="Calibri" w:eastAsia="Calibri"/>
+          <w:b w:val="0"/>
+          <w:sz w:val="22"/>
+        </w:rPr>
+        <w:t>Feature selection is also leakage control. For high_risk_flag classification, the input cannot use digital_dependence_score, productivity_score, anxiety_score, depression_score, stress_level, happiness_score, focus_score, id, or high_risk_flag itself. Otherwise the model would learn from outcome information rather than behavior evidence.</w:t>
       </w:r>
     </w:p>
     <w:p>
@@ -1766,28 +2082,28 @@
           <w:color w:val="9B1C1C"/>
           <w:sz w:val="21"/>
         </w:rPr>
-        <w:t>[INSERT TABLE5 SCREENSHOT HERE: screenshot_tables/table5_range_check.xlsx]</w:t>
-      </w:r>
-    </w:p>
-    <w:p>
-      <w:pPr>
-        <w:spacing w:line="269" w:lineRule="auto" w:after="100"/>
-      </w:pPr>
-      <w:r>
-        <w:rPr>
-          <w:rFonts w:ascii="Calibri" w:hAnsi="Calibri" w:eastAsia="Calibri"/>
-          <w:b/>
-          <w:sz w:val="22"/>
-        </w:rPr>
-        <w:t>Table5</w:t>
-      </w:r>
-      <w:r>
-        <w:rPr>
-          <w:rFonts w:ascii="Calibri" w:hAnsi="Calibri" w:eastAsia="Calibri"/>
-          <w:b w:val="0"/>
-          <w:sz w:val="22"/>
-        </w:rPr>
-        <w:t xml:space="preserve"> Range Check</w:t>
+        <w:t>[INSERT TABLE7 SCREENSHOT HERE: screenshot_tables/table7_feature_selection_and_leakage_control.xlsx]</w:t>
+      </w:r>
+    </w:p>
+    <w:p>
+      <w:pPr>
+        <w:spacing w:line="269" w:lineRule="auto" w:after="100"/>
+      </w:pPr>
+      <w:r>
+        <w:rPr>
+          <w:rFonts w:ascii="Calibri" w:hAnsi="Calibri" w:eastAsia="Calibri"/>
+          <w:b/>
+          <w:sz w:val="22"/>
+        </w:rPr>
+        <w:t>Table7</w:t>
+      </w:r>
+      <w:r>
+        <w:rPr>
+          <w:rFonts w:ascii="Calibri" w:hAnsi="Calibri" w:eastAsia="Calibri"/>
+          <w:b w:val="0"/>
+          <w:sz w:val="22"/>
+        </w:rPr>
+        <w:t xml:space="preserve"> Feature Selection and Leakage Control</w:t>
       </w:r>
     </w:p>
     <w:p>
@@ -1808,7 +2124,7 @@
           <w:b w:val="0"/>
           <w:sz w:val="22"/>
         </w:rPr>
-        <w:t xml:space="preserve"> This screenshot shows min, max, mean, reasonable range, and pass status for key numerical fields.</w:t>
+        <w:t xml:space="preserve"> This screenshot records dropped columns and retained features for the main tasks.</w:t>
       </w:r>
     </w:p>
     <w:p>
@@ -1829,7 +2145,7 @@
           <w:b w:val="0"/>
           <w:sz w:val="22"/>
         </w:rPr>
-        <w:t xml:space="preserve"> The checked variables stay inside the expected ranges, so no serious abnormal record is removed.</w:t>
+        <w:t xml:space="preserve"> The classification task removes outcome columns. The clustering task uses only digital behavior and lifestyle numerical features.</w:t>
       </w:r>
     </w:p>
     <w:p>
@@ -1850,7 +2166,73 @@
           <w:b w:val="0"/>
           <w:sz w:val="22"/>
         </w:rPr>
-        <w:t xml:space="preserve"> The range check supports later statistical analysis because the main numerical fields are usable.</w:t>
+        <w:t xml:space="preserve"> This step makes the modeling results more credible because the input features match the purpose of each task.</w:t>
+      </w:r>
+    </w:p>
+    <w:p>
+      <w:pPr>
+        <w:spacing w:before="80" w:after="80"/>
+      </w:pPr>
+      <w:r>
+        <w:rPr>
+          <w:rFonts w:ascii="Consolas" w:hAnsi="Consolas" w:eastAsia="Consolas"/>
+          <w:b/>
+          <w:color w:val="9B1C1C"/>
+          <w:sz w:val="21"/>
+        </w:rPr>
+        <w:t>[PASTE CODE4 HERE FROM report_code_snippets.md: Code4 Leakage Control and Task-Specific Feature Selection]</w:t>
+      </w:r>
+    </w:p>
+    <w:p>
+      <w:pPr>
+        <w:spacing w:line="269" w:lineRule="auto" w:after="100"/>
+      </w:pPr>
+      <w:r>
+        <w:rPr>
+          <w:rFonts w:ascii="Calibri" w:hAnsi="Calibri" w:eastAsia="Calibri"/>
+          <w:b w:val="0"/>
+          <w:sz w:val="22"/>
+        </w:rPr>
+        <w:t>Explanation: This code is used to define task-specific drop columns and clustering feature lists.</w:t>
+      </w:r>
+    </w:p>
+    <w:p>
+      <w:pPr>
+        <w:spacing w:line="269" w:lineRule="auto" w:after="100"/>
+      </w:pPr>
+      <w:r>
+        <w:rPr>
+          <w:rFonts w:ascii="Calibri" w:hAnsi="Calibri" w:eastAsia="Calibri"/>
+          <w:b w:val="0"/>
+          <w:sz w:val="22"/>
+        </w:rPr>
+        <w:t>It is necessary because classification, regression, and clustering should not use the same input columns blindly.</w:t>
+      </w:r>
+    </w:p>
+    <w:p>
+      <w:pPr>
+        <w:spacing w:line="269" w:lineRule="auto" w:after="100"/>
+      </w:pPr>
+      <w:r>
+        <w:rPr>
+          <w:rFonts w:ascii="Calibri" w:hAnsi="Calibri" w:eastAsia="Calibri"/>
+          <w:b w:val="0"/>
+          <w:sz w:val="22"/>
+        </w:rPr>
+        <w:t>The output is separate feature sets for classification, regression, and clustering.</w:t>
+      </w:r>
+    </w:p>
+    <w:p>
+      <w:pPr>
+        <w:spacing w:line="269" w:lineRule="auto" w:after="100"/>
+      </w:pPr>
+      <w:r>
+        <w:rPr>
+          <w:rFonts w:ascii="Calibri" w:hAnsi="Calibri" w:eastAsia="Calibri"/>
+          <w:b w:val="0"/>
+          <w:sz w:val="22"/>
+        </w:rPr>
+        <w:t>This result supports fairer model evaluation and more meaningful user-profile interpretation.</w:t>
       </w:r>
     </w:p>
     <w:p>
@@ -1864,20 +2246,20 @@
           <w:color w:val="2E74B5"/>
           <w:sz w:val="25"/>
         </w:rPr>
-        <w:t>3.4 Feature Engineering</w:t>
-      </w:r>
-    </w:p>
-    <w:p>
-      <w:pPr>
-        <w:spacing w:line="269" w:lineRule="auto" w:after="100"/>
-      </w:pPr>
-      <w:r>
-        <w:rPr>
-          <w:rFonts w:ascii="Calibri" w:hAnsi="Calibri" w:eastAsia="Calibri"/>
-          <w:b w:val="0"/>
-          <w:sz w:val="22"/>
-        </w:rPr>
-        <w:t>Feature engineering extracts behavior ratios and interaction information from the original columns. The new features are social_media_hours, study_hours, notifications_per_device_hour, unlocks_per_device_hour, device_to_sleep_ratio, activity_sleep_interaction, and social_to_study_ratio.</w:t>
+        <w:t>3.6 PCA and Probabilistic Clustering Extension</w:t>
+      </w:r>
+    </w:p>
+    <w:p>
+      <w:pPr>
+        <w:spacing w:line="269" w:lineRule="auto" w:after="100"/>
+      </w:pPr>
+      <w:r>
+        <w:rPr>
+          <w:rFonts w:ascii="Calibri" w:hAnsi="Calibri" w:eastAsia="Calibri"/>
+          <w:b w:val="0"/>
+          <w:sz w:val="22"/>
+        </w:rPr>
+        <w:t>PCA is used only for dimensionality reduction visualization and structure understanding. The first two principal components explain about 42.41% variance. PCA is not used as input for classification or regression. Because the clustering inputs are mainly continuous numerical variables, a separate LCA model is not used. GaussianMixture is used as a probabilistic clustering extension to respond to the latent-group idea.</w:t>
       </w:r>
     </w:p>
     <w:p>
@@ -1891,28 +2273,28 @@
           <w:color w:val="9B1C1C"/>
           <w:sz w:val="21"/>
         </w:rPr>
-        <w:t>[INSERT TABLE6 SCREENSHOT HERE: screenshot_tables/table6_engineered_features_preview.xlsx]</w:t>
-      </w:r>
-    </w:p>
-    <w:p>
-      <w:pPr>
-        <w:spacing w:line="269" w:lineRule="auto" w:after="100"/>
-      </w:pPr>
-      <w:r>
-        <w:rPr>
-          <w:rFonts w:ascii="Calibri" w:hAnsi="Calibri" w:eastAsia="Calibri"/>
-          <w:b/>
-          <w:sz w:val="22"/>
-        </w:rPr>
-        <w:t>Table6</w:t>
-      </w:r>
-      <w:r>
-        <w:rPr>
-          <w:rFonts w:ascii="Calibri" w:hAnsi="Calibri" w:eastAsia="Calibri"/>
-          <w:b w:val="0"/>
-          <w:sz w:val="22"/>
-        </w:rPr>
-        <w:t xml:space="preserve"> Engineered Features Preview</w:t>
+        <w:t>[INSERT TABLE8 SCREENSHOT HERE: screenshot_tables/table8_pca_explained_variance.xlsx]</w:t>
+      </w:r>
+    </w:p>
+    <w:p>
+      <w:pPr>
+        <w:spacing w:line="269" w:lineRule="auto" w:after="100"/>
+      </w:pPr>
+      <w:r>
+        <w:rPr>
+          <w:rFonts w:ascii="Calibri" w:hAnsi="Calibri" w:eastAsia="Calibri"/>
+          <w:b/>
+          <w:sz w:val="22"/>
+        </w:rPr>
+        <w:t>Table8</w:t>
+      </w:r>
+      <w:r>
+        <w:rPr>
+          <w:rFonts w:ascii="Calibri" w:hAnsi="Calibri" w:eastAsia="Calibri"/>
+          <w:b w:val="0"/>
+          <w:sz w:val="22"/>
+        </w:rPr>
+        <w:t xml:space="preserve"> PCA Explained Variance</w:t>
       </w:r>
     </w:p>
     <w:p>
@@ -1933,7 +2315,7 @@
           <w:b w:val="0"/>
           <w:sz w:val="22"/>
         </w:rPr>
-        <w:t xml:space="preserve"> This screenshot shows the engineered features beside key original behavior variables.</w:t>
+        <w:t xml:space="preserve"> This screenshot records the explained variance ratio and cumulative explained variance of PCA components.</w:t>
       </w:r>
     </w:p>
     <w:p>
@@ -1954,7 +2336,7 @@
           <w:b w:val="0"/>
           <w:sz w:val="22"/>
         </w:rPr>
-        <w:t xml:space="preserve"> The new features transform raw minutes and counts into more interpretable ratios and interaction terms.</w:t>
+        <w:t xml:space="preserve"> PC1 and PC2 explain about 42.41% of the total variance, so a two-dimensional PCA view only captures part of the high-dimensional behavior structure.</w:t>
       </w:r>
     </w:p>
     <w:p>
@@ -1975,7 +2357,39 @@
           <w:b w:val="0"/>
           <w:sz w:val="22"/>
         </w:rPr>
-        <w:t xml:space="preserve"> These features help classification, regression, and clustering use behavior intensity rather than only raw counts.</w:t>
+        <w:t xml:space="preserve"> The PCA evidence supports dimensionality-reduction discussion, but PCA is used only for auxiliary understanding rather than replacing the original modeling features.</w:t>
+      </w:r>
+    </w:p>
+    <w:p>
+      <w:r>
+        <w:br w:type="page"/>
+      </w:r>
+    </w:p>
+    <w:p>
+      <w:pPr>
+        <w:pStyle w:val="1"/>
+      </w:pPr>
+      <w:r>
+        <w:rPr>
+          <w:rFonts w:ascii="Calibri" w:hAnsi="Calibri" w:eastAsia="Calibri"/>
+          <w:b/>
+          <w:color w:val="1F4D78"/>
+          <w:sz w:val="30"/>
+        </w:rPr>
+        <w:t>4. Statistical Exploration and Visualization</w:t>
+      </w:r>
+    </w:p>
+    <w:p>
+      <w:pPr>
+        <w:spacing w:line="269" w:lineRule="auto" w:after="100"/>
+      </w:pPr>
+      <w:r>
+        <w:rPr>
+          <w:rFonts w:ascii="Calibri" w:hAnsi="Calibri" w:eastAsia="Calibri"/>
+          <w:b w:val="0"/>
+          <w:sz w:val="22"/>
+        </w:rPr>
+        <w:t>This section uses statistical summaries and visualizations to understand the mathematical structure of the dataset before modeling. The goal is to connect raw variables with later modeling choices instead of using figures as decoration.</w:t>
       </w:r>
     </w:p>
     <w:p>
@@ -1989,121 +2403,28 @@
           <w:color w:val="9B1C1C"/>
           <w:sz w:val="21"/>
         </w:rPr>
-        <w:t>[PASTE CODE3 HERE FROM report_code_snippets.md: Code3 Feature Engineering]</w:t>
-      </w:r>
-    </w:p>
-    <w:p>
-      <w:pPr>
-        <w:spacing w:line="269" w:lineRule="auto" w:after="100"/>
-      </w:pPr>
-      <w:r>
-        <w:rPr>
-          <w:rFonts w:ascii="Calibri" w:hAnsi="Calibri" w:eastAsia="Calibri"/>
-          <w:b w:val="0"/>
-          <w:sz w:val="22"/>
-        </w:rPr>
-        <w:t>Explanation: This code is used to create behavior-hour, ratio, and interaction features from the raw columns.</w:t>
-      </w:r>
-    </w:p>
-    <w:p>
-      <w:pPr>
-        <w:spacing w:line="269" w:lineRule="auto" w:after="100"/>
-      </w:pPr>
-      <w:r>
-        <w:rPr>
-          <w:rFonts w:ascii="Calibri" w:hAnsi="Calibri" w:eastAsia="Calibri"/>
-          <w:b w:val="0"/>
-          <w:sz w:val="22"/>
-        </w:rPr>
-        <w:t>It is necessary because raw variables such as minutes and counts do not always describe intensity directly.</w:t>
-      </w:r>
-    </w:p>
-    <w:p>
-      <w:pPr>
-        <w:spacing w:line="269" w:lineRule="auto" w:after="100"/>
-      </w:pPr>
-      <w:r>
-        <w:rPr>
-          <w:rFonts w:ascii="Calibri" w:hAnsi="Calibri" w:eastAsia="Calibri"/>
-          <w:b w:val="0"/>
-          <w:sz w:val="22"/>
-        </w:rPr>
-        <w:t>The output is seven engineered features added to the processed dataset.</w:t>
-      </w:r>
-    </w:p>
-    <w:p>
-      <w:pPr>
-        <w:spacing w:line="269" w:lineRule="auto" w:after="100"/>
-      </w:pPr>
-      <w:r>
-        <w:rPr>
-          <w:rFonts w:ascii="Calibri" w:hAnsi="Calibri" w:eastAsia="Calibri"/>
-          <w:b w:val="0"/>
-          <w:sz w:val="22"/>
-        </w:rPr>
-        <w:t>This result supports later modeling and clustering by adding behavior-density information.</w:t>
-      </w:r>
-    </w:p>
-    <w:p>
-      <w:pPr>
-        <w:pStyle w:val="2"/>
-      </w:pPr>
-      <w:r>
-        <w:rPr>
-          <w:rFonts w:ascii="Calibri" w:hAnsi="Calibri" w:eastAsia="Calibri"/>
-          <w:b/>
-          <w:color w:val="2E74B5"/>
-          <w:sz w:val="25"/>
-        </w:rPr>
-        <w:t>3.5 Feature Selection and Leakage Control</w:t>
-      </w:r>
-    </w:p>
-    <w:p>
-      <w:pPr>
-        <w:spacing w:line="269" w:lineRule="auto" w:after="100"/>
-      </w:pPr>
-      <w:r>
-        <w:rPr>
-          <w:rFonts w:ascii="Calibri" w:hAnsi="Calibri" w:eastAsia="Calibri"/>
-          <w:b w:val="0"/>
-          <w:sz w:val="22"/>
-        </w:rPr>
-        <w:t>Feature selection is also leakage control. For high_risk_flag classification, the input cannot use digital_dependence_score, productivity_score, anxiety_score, depression_score, stress_level, happiness_score, focus_score, id, or high_risk_flag itself. Otherwise the model would learn from outcome information rather than behavior evidence.</w:t>
-      </w:r>
-    </w:p>
-    <w:p>
-      <w:pPr>
-        <w:spacing w:before="80" w:after="80"/>
-      </w:pPr>
-      <w:r>
-        <w:rPr>
-          <w:rFonts w:ascii="Consolas" w:hAnsi="Consolas" w:eastAsia="Consolas"/>
-          <w:b/>
-          <w:color w:val="9B1C1C"/>
-          <w:sz w:val="21"/>
-        </w:rPr>
-        <w:t>[INSERT TABLE7 SCREENSHOT HERE: screenshot_tables/table7_feature_selection_leakage_control.xlsx]</w:t>
-      </w:r>
-    </w:p>
-    <w:p>
-      <w:pPr>
-        <w:spacing w:line="269" w:lineRule="auto" w:after="100"/>
-      </w:pPr>
-      <w:r>
-        <w:rPr>
-          <w:rFonts w:ascii="Calibri" w:hAnsi="Calibri" w:eastAsia="Calibri"/>
-          <w:b/>
-          <w:sz w:val="22"/>
-        </w:rPr>
-        <w:t>Table7</w:t>
-      </w:r>
-      <w:r>
-        <w:rPr>
-          <w:rFonts w:ascii="Calibri" w:hAnsi="Calibri" w:eastAsia="Calibri"/>
-          <w:b w:val="0"/>
-          <w:sz w:val="22"/>
-        </w:rPr>
-        <w:t xml:space="preserve"> Feature Selection and Leakage Control</w:t>
+        <w:t>[INSERT TABLE9 SCREENSHOT HERE: screenshot_tables/table9_descriptive_statistical_summary.xlsx]</w:t>
+      </w:r>
+    </w:p>
+    <w:p>
+      <w:pPr>
+        <w:spacing w:line="269" w:lineRule="auto" w:after="100"/>
+      </w:pPr>
+      <w:r>
+        <w:rPr>
+          <w:rFonts w:ascii="Calibri" w:hAnsi="Calibri" w:eastAsia="Calibri"/>
+          <w:b/>
+          <w:sz w:val="22"/>
+        </w:rPr>
+        <w:t>Table9</w:t>
+      </w:r>
+      <w:r>
+        <w:rPr>
+          <w:rFonts w:ascii="Calibri" w:hAnsi="Calibri" w:eastAsia="Calibri"/>
+          <w:b w:val="0"/>
+          <w:sz w:val="22"/>
+        </w:rPr>
+        <w:t xml:space="preserve"> Descriptive Statistical Summary</w:t>
       </w:r>
     </w:p>
     <w:p>
@@ -2124,7 +2445,7 @@
           <w:b w:val="0"/>
           <w:sz w:val="22"/>
         </w:rPr>
-        <w:t xml:space="preserve"> This screenshot records dropped columns and retained features for the main tasks.</w:t>
+        <w:t xml:space="preserve"> This screenshot provides mathematical descriptive statistics before visual analysis.</w:t>
       </w:r>
     </w:p>
     <w:p>
@@ -2145,7 +2466,7 @@
           <w:b w:val="0"/>
           <w:sz w:val="22"/>
         </w:rPr>
-        <w:t xml:space="preserve"> The classification task removes outcome columns. The clustering task uses only digital behavior and lifestyle numerical features.</w:t>
+        <w:t xml:space="preserve"> The variables have different means, ranges, and standard deviations. For example, notifications, phone unlocks, social media time, and device hours are measured on different scales.</w:t>
       </w:r>
     </w:p>
     <w:p>
@@ -2166,230 +2487,7 @@
           <w:b w:val="0"/>
           <w:sz w:val="22"/>
         </w:rPr>
-        <w:t xml:space="preserve"> This step makes the modeling results more credible because the input features match the purpose of each task.</w:t>
-      </w:r>
-    </w:p>
-    <w:p>
-      <w:pPr>
-        <w:spacing w:before="80" w:after="80"/>
-      </w:pPr>
-      <w:r>
-        <w:rPr>
-          <w:rFonts w:ascii="Consolas" w:hAnsi="Consolas" w:eastAsia="Consolas"/>
-          <w:b/>
-          <w:color w:val="9B1C1C"/>
-          <w:sz w:val="21"/>
-        </w:rPr>
-        <w:t>[PASTE CODE4 HERE FROM report_code_snippets.md: Code4 Leakage Control and Feature Selection]</w:t>
-      </w:r>
-    </w:p>
-    <w:p>
-      <w:pPr>
-        <w:spacing w:line="269" w:lineRule="auto" w:after="100"/>
-      </w:pPr>
-      <w:r>
-        <w:rPr>
-          <w:rFonts w:ascii="Calibri" w:hAnsi="Calibri" w:eastAsia="Calibri"/>
-          <w:b w:val="0"/>
-          <w:sz w:val="22"/>
-        </w:rPr>
-        <w:t>Explanation: This code is used to define task-specific drop columns and clustering feature lists.</w:t>
-      </w:r>
-    </w:p>
-    <w:p>
-      <w:pPr>
-        <w:spacing w:line="269" w:lineRule="auto" w:after="100"/>
-      </w:pPr>
-      <w:r>
-        <w:rPr>
-          <w:rFonts w:ascii="Calibri" w:hAnsi="Calibri" w:eastAsia="Calibri"/>
-          <w:b w:val="0"/>
-          <w:sz w:val="22"/>
-        </w:rPr>
-        <w:t>It is necessary because classification, regression, and clustering should not use the same input columns blindly.</w:t>
-      </w:r>
-    </w:p>
-    <w:p>
-      <w:pPr>
-        <w:spacing w:line="269" w:lineRule="auto" w:after="100"/>
-      </w:pPr>
-      <w:r>
-        <w:rPr>
-          <w:rFonts w:ascii="Calibri" w:hAnsi="Calibri" w:eastAsia="Calibri"/>
-          <w:b w:val="0"/>
-          <w:sz w:val="22"/>
-        </w:rPr>
-        <w:t>The output is separate feature sets for classification, regression, and clustering.</w:t>
-      </w:r>
-    </w:p>
-    <w:p>
-      <w:pPr>
-        <w:spacing w:line="269" w:lineRule="auto" w:after="100"/>
-      </w:pPr>
-      <w:r>
-        <w:rPr>
-          <w:rFonts w:ascii="Calibri" w:hAnsi="Calibri" w:eastAsia="Calibri"/>
-          <w:b w:val="0"/>
-          <w:sz w:val="22"/>
-        </w:rPr>
-        <w:t>This result supports fairer model evaluation and more meaningful user-profile interpretation.</w:t>
-      </w:r>
-    </w:p>
-    <w:p>
-      <w:pPr>
-        <w:pStyle w:val="2"/>
-      </w:pPr>
-      <w:r>
-        <w:rPr>
-          <w:rFonts w:ascii="Calibri" w:hAnsi="Calibri" w:eastAsia="Calibri"/>
-          <w:b/>
-          <w:color w:val="2E74B5"/>
-          <w:sz w:val="25"/>
-        </w:rPr>
-        <w:t>3.6 PCA and Probabilistic Clustering Extension</w:t>
-      </w:r>
-    </w:p>
-    <w:p>
-      <w:pPr>
-        <w:spacing w:line="269" w:lineRule="auto" w:after="100"/>
-      </w:pPr>
-      <w:r>
-        <w:rPr>
-          <w:rFonts w:ascii="Calibri" w:hAnsi="Calibri" w:eastAsia="Calibri"/>
-          <w:b w:val="0"/>
-          <w:sz w:val="22"/>
-        </w:rPr>
-        <w:t>PCA is used only for dimensionality reduction visualization and structure understanding. The first two principal components explain about 42.41% variance. PCA is not used as input for classification or regression. Because the clustering inputs are mainly continuous numerical variables, a separate LCA model is not used. GaussianMixture is used as a probabilistic clustering extension to respond to the latent-group idea.</w:t>
-      </w:r>
-    </w:p>
-    <w:p>
-      <w:pPr>
-        <w:spacing w:before="80" w:after="80"/>
-      </w:pPr>
-      <w:r>
-        <w:rPr>
-          <w:rFonts w:ascii="Consolas" w:hAnsi="Consolas" w:eastAsia="Consolas"/>
-          <w:b/>
-          <w:color w:val="9B1C1C"/>
-          <w:sz w:val="21"/>
-        </w:rPr>
-        <w:t>[INSERT TABLE11 SCREENSHOT HERE: screenshot_tables/table11_pca_explained_variance.xlsx]</w:t>
-      </w:r>
-    </w:p>
-    <w:p>
-      <w:pPr>
-        <w:spacing w:line="269" w:lineRule="auto" w:after="100"/>
-      </w:pPr>
-      <w:r>
-        <w:rPr>
-          <w:rFonts w:ascii="Calibri" w:hAnsi="Calibri" w:eastAsia="Calibri"/>
-          <w:b/>
-          <w:sz w:val="22"/>
-        </w:rPr>
-        <w:t>Table11</w:t>
-      </w:r>
-      <w:r>
-        <w:rPr>
-          <w:rFonts w:ascii="Calibri" w:hAnsi="Calibri" w:eastAsia="Calibri"/>
-          <w:b w:val="0"/>
-          <w:sz w:val="22"/>
-        </w:rPr>
-        <w:t xml:space="preserve"> PCA Explained Variance</w:t>
-      </w:r>
-    </w:p>
-    <w:p>
-      <w:pPr>
-        <w:spacing w:line="269" w:lineRule="auto" w:after="100"/>
-      </w:pPr>
-      <w:r>
-        <w:rPr>
-          <w:rFonts w:ascii="Calibri" w:hAnsi="Calibri" w:eastAsia="Calibri"/>
-          <w:b/>
-          <w:sz w:val="22"/>
-        </w:rPr>
-        <w:t>Purpose:</w:t>
-      </w:r>
-      <w:r>
-        <w:rPr>
-          <w:rFonts w:ascii="Calibri" w:hAnsi="Calibri" w:eastAsia="Calibri"/>
-          <w:b w:val="0"/>
-          <w:sz w:val="22"/>
-        </w:rPr>
-        <w:t xml:space="preserve"> This screenshot records the explained variance ratio and cumulative explained variance of PCA components.</w:t>
-      </w:r>
-    </w:p>
-    <w:p>
-      <w:pPr>
-        <w:spacing w:line="269" w:lineRule="auto" w:after="100"/>
-      </w:pPr>
-      <w:r>
-        <w:rPr>
-          <w:rFonts w:ascii="Calibri" w:hAnsi="Calibri" w:eastAsia="Calibri"/>
-          <w:b/>
-          <w:sz w:val="22"/>
-        </w:rPr>
-        <w:t>Interpretation:</w:t>
-      </w:r>
-      <w:r>
-        <w:rPr>
-          <w:rFonts w:ascii="Calibri" w:hAnsi="Calibri" w:eastAsia="Calibri"/>
-          <w:b w:val="0"/>
-          <w:sz w:val="22"/>
-        </w:rPr>
-        <w:t xml:space="preserve"> PC1 and PC2 explain about 42.41% of the total variance, so a two-dimensional PCA view only captures part of the high-dimensional behavior structure.</w:t>
-      </w:r>
-    </w:p>
-    <w:p>
-      <w:pPr>
-        <w:spacing w:line="269" w:lineRule="auto" w:after="100"/>
-      </w:pPr>
-      <w:r>
-        <w:rPr>
-          <w:rFonts w:ascii="Calibri" w:hAnsi="Calibri" w:eastAsia="Calibri"/>
-          <w:b/>
-          <w:sz w:val="22"/>
-        </w:rPr>
-        <w:t>Conclusion:</w:t>
-      </w:r>
-      <w:r>
-        <w:rPr>
-          <w:rFonts w:ascii="Calibri" w:hAnsi="Calibri" w:eastAsia="Calibri"/>
-          <w:b w:val="0"/>
-          <w:sz w:val="22"/>
-        </w:rPr>
-        <w:t xml:space="preserve"> The PCA evidence supports dimensionality-reduction discussion, but PCA is used only for auxiliary understanding rather than replacing the original modeling features.</w:t>
-      </w:r>
-    </w:p>
-    <w:p>
-      <w:r>
-        <w:br w:type="page"/>
-      </w:r>
-    </w:p>
-    <w:p>
-      <w:pPr>
-        <w:pStyle w:val="1"/>
-      </w:pPr>
-      <w:r>
-        <w:rPr>
-          <w:rFonts w:ascii="Calibri" w:hAnsi="Calibri" w:eastAsia="Calibri"/>
-          <w:b/>
-          <w:color w:val="1F4D78"/>
-          <w:sz w:val="30"/>
-        </w:rPr>
-        <w:t>4. Statistical Exploration and Visualization</w:t>
-      </w:r>
-    </w:p>
-    <w:p>
-      <w:pPr>
-        <w:spacing w:line="269" w:lineRule="auto" w:after="100"/>
-      </w:pPr>
-      <w:r>
-        <w:rPr>
-          <w:rFonts w:ascii="Calibri" w:hAnsi="Calibri" w:eastAsia="Calibri"/>
-          <w:b w:val="0"/>
-          <w:sz w:val="22"/>
-        </w:rPr>
-        <w:t>This section uses statistical summaries and visualizations to understand the mathematical structure of the dataset before modeling. The goal is to connect raw variables with later modeling choices instead of using figures as decoration.</w:t>
+        <w:t xml:space="preserve"> The descriptive statistics support later visualization and also explain why scaling is needed before PCA and clustering.</w:t>
       </w:r>
     </w:p>
     <w:p>
@@ -2800,7 +2898,7 @@
           <w:b w:val="0"/>
           <w:sz w:val="22"/>
         </w:rPr>
-        <w:t xml:space="preserve"> The correlation pattern supports using behavior variables for digital dependence prediction but also warns that correlation is not causation.</w:t>
+        <w:t xml:space="preserve"> This result explains why digital_dependence_score is easier to predict than productivity_score, because the correlation pattern around productivity_score is much weaker. The heatmap also warns that correlation is not causation.</w:t>
       </w:r>
     </w:p>
     <w:p>
@@ -2937,7 +3035,7 @@
           <w:b w:val="0"/>
           <w:sz w:val="22"/>
         </w:rPr>
-        <w:t xml:space="preserve"> The overlap explains why the classifier is useful as a screening reference but should not be treated as a perfect separator.</w:t>
+        <w:t xml:space="preserve"> The overlap between High Risk and No Risk groups explains why the classifier cannot be perfect. It also supports threshold tuning instead of relying on a default decision boundary.</w:t>
       </w:r>
     </w:p>
     <w:p>
@@ -3015,6 +3113,19 @@
     </w:p>
     <w:p>
       <w:pPr>
+        <w:spacing w:line="269" w:lineRule="auto" w:after="100"/>
+      </w:pPr>
+      <w:r>
+        <w:rPr>
+          <w:rFonts w:ascii="Calibri" w:hAnsi="Calibri" w:eastAsia="Calibri"/>
+          <w:b w:val="0"/>
+          <w:sz w:val="22"/>
+        </w:rPr>
+        <w:t>The model selection logic is different for each task. Classification focuses on recall-oriented screening and PR-AUC; regression focuses on R², MSE, and MAE; clustering focuses on silhouette, elbow trend, and profile interpretability.</w:t>
+      </w:r>
+    </w:p>
+    <w:p>
+      <w:pPr>
         <w:pStyle w:val="2"/>
       </w:pPr>
       <w:r>
@@ -3037,7 +3148,20 @@
           <w:b w:val="0"/>
           <w:sz w:val="22"/>
         </w:rPr>
-        <w:t>The classification target is high_risk_flag. Logistic Regression, Random Forest, and Gradient Boosting are compared. The final model is Gradient Boosting with threshold=0.14. Accuracy alone is not enough because the High Risk group is smaller and missed High Risk samples matter more in a screening task.</w:t>
+        <w:t>The classification target is high_risk_flag. To avoid target leakage, digital_dependence_score, productivity_score, anxiety_score, depression_score, stress_level, happiness_score, focus_score, id, and high_risk_flag itself are excluded from the classification input. Logistic Regression, Random Forest, and Gradient Boosting are compared.</w:t>
+      </w:r>
+    </w:p>
+    <w:p>
+      <w:pPr>
+        <w:spacing w:line="269" w:lineRule="auto" w:after="100"/>
+      </w:pPr>
+      <w:r>
+        <w:rPr>
+          <w:rFonts w:ascii="Calibri" w:hAnsi="Calibri" w:eastAsia="Calibri"/>
+          <w:b w:val="0"/>
+          <w:sz w:val="22"/>
+        </w:rPr>
+        <w:t>Gradient Boosting is selected because it gives the most suitable overall screening performance under the selected evaluation logic, especially PR-AUC and the final threshold-based Recall/F1 trade-off. Accuracy alone is not enough because the High Risk group is smaller and missed High Risk samples matter more in a screening task.</w:t>
       </w:r>
     </w:p>
     <w:p>
@@ -3051,28 +3175,28 @@
           <w:color w:val="9B1C1C"/>
           <w:sz w:val="21"/>
         </w:rPr>
-        <w:t>[INSERT TABLE8 SCREENSHOT HERE: screenshot_tables/table8_classification_metrics.xlsx]</w:t>
-      </w:r>
-    </w:p>
-    <w:p>
-      <w:pPr>
-        <w:spacing w:line="269" w:lineRule="auto" w:after="100"/>
-      </w:pPr>
-      <w:r>
-        <w:rPr>
-          <w:rFonts w:ascii="Calibri" w:hAnsi="Calibri" w:eastAsia="Calibri"/>
-          <w:b/>
-          <w:sz w:val="22"/>
-        </w:rPr>
-        <w:t>Table8</w:t>
-      </w:r>
-      <w:r>
-        <w:rPr>
-          <w:rFonts w:ascii="Calibri" w:hAnsi="Calibri" w:eastAsia="Calibri"/>
-          <w:b w:val="0"/>
-          <w:sz w:val="22"/>
-        </w:rPr>
-        <w:t xml:space="preserve"> Classification Metrics</w:t>
+        <w:t>[INSERT TABLE10 SCREENSHOT HERE: screenshot_tables/table10_classification_model_comparison_and_threshold_results.xlsx]</w:t>
+      </w:r>
+    </w:p>
+    <w:p>
+      <w:pPr>
+        <w:spacing w:line="269" w:lineRule="auto" w:after="100"/>
+      </w:pPr>
+      <w:r>
+        <w:rPr>
+          <w:rFonts w:ascii="Calibri" w:hAnsi="Calibri" w:eastAsia="Calibri"/>
+          <w:b/>
+          <w:sz w:val="22"/>
+        </w:rPr>
+        <w:t>Table10</w:t>
+      </w:r>
+      <w:r>
+        <w:rPr>
+          <w:rFonts w:ascii="Calibri" w:hAnsi="Calibri" w:eastAsia="Calibri"/>
+          <w:b w:val="0"/>
+          <w:sz w:val="22"/>
+        </w:rPr>
+        <w:t xml:space="preserve"> Classification Model Comparison and Threshold Results</w:t>
       </w:r>
     </w:p>
     <w:p>
@@ -3093,7 +3217,7 @@
           <w:b w:val="0"/>
           <w:sz w:val="22"/>
         </w:rPr>
-        <w:t xml:space="preserve"> This screenshot records the classification metrics and threshold policies.</w:t>
+        <w:t xml:space="preserve"> This screenshot records candidate model comparison, threshold strategies, final test metrics, and confusion-matrix counts.</w:t>
       </w:r>
     </w:p>
     <w:p>
@@ -3114,7 +3238,7 @@
           <w:b w:val="0"/>
           <w:sz w:val="22"/>
         </w:rPr>
-        <w:t xml:space="preserve"> The final threshold=0.14 gives Recall=0.6420, F1=0.5355, and PR-AUC=0.5084.</w:t>
+        <w:t xml:space="preserve"> The final Gradient Boosting threshold=0.14 gives Recall=0.6420, F1=0.5355, and PR-AUC=0.5084.</w:t>
       </w:r>
     </w:p>
     <w:p>
@@ -3135,7 +3259,7 @@
           <w:b w:val="0"/>
           <w:sz w:val="22"/>
         </w:rPr>
-        <w:t xml:space="preserve"> The result is not perfect, but it makes sense as a recall-oriented High Risk screening strategy.</w:t>
+        <w:t xml:space="preserve"> The result is not perfect, but it makes sense as a recall-oriented High Risk screening strategy rather than a final individual-level judgment.</w:t>
       </w:r>
     </w:p>
     <w:p>
@@ -3258,7 +3382,7 @@
           <w:b w:val="0"/>
           <w:sz w:val="22"/>
         </w:rPr>
-        <w:t xml:space="preserve"> The threshold of 0.14 is selected to find more true High Risk samples, even though it increases false positives.</w:t>
+        <w:t xml:space="preserve"> The selected threshold is not chosen because it gives the highest Accuracy, but because it better matches the screening purpose. The threshold of 0.14 is selected to find more true High Risk samples, even though it increases false positives.</w:t>
       </w:r>
     </w:p>
     <w:p>
@@ -3518,7 +3642,7 @@
           <w:color w:val="9B1C1C"/>
           <w:sz w:val="21"/>
         </w:rPr>
-        <w:t>[PASTE CODE5 HERE FROM report_code_snippets.md: Code5 Classification Training and Threshold Tuning]</w:t>
+        <w:t>[PASTE CODE5 HERE FROM report_code_snippets.md: Code5 Classification Model Comparison and Threshold Tuning]</w:t>
       </w:r>
     </w:p>
     <w:p>
@@ -3610,7 +3734,20 @@
           <w:b w:val="0"/>
           <w:sz w:val="22"/>
         </w:rPr>
-        <w:t>The main regression target is digital_dependence_score. The best model reaches R²=0.9839, MSE=3.1471, and MAE=0.9982. This means the current behavior and lifestyle features strongly represent digital dependence in this benchmark dataset. The auxiliary productivity_score task has R²=-0.0041, so it is kept as a weak-prediction result.</w:t>
+        <w:t>The main regression target is digital_dependence_score. Gradient Boosting reaches R²=0.9839, MSE=3.1471, and MAE=0.9982. It is selected because it gives the strongest overall performance under the report's main criterion, especially R² and MSE.</w:t>
+      </w:r>
+    </w:p>
+    <w:p>
+      <w:pPr>
+        <w:spacing w:line="269" w:lineRule="auto" w:after="100"/>
+      </w:pPr>
+      <w:r>
+        <w:rPr>
+          <w:rFonts w:ascii="Calibri" w:hAnsi="Calibri" w:eastAsia="Calibri"/>
+          <w:b w:val="0"/>
+          <w:sz w:val="22"/>
+        </w:rPr>
+        <w:t>Although linear models may have a slightly lower MAE in some results, Gradient Boosting is kept as the final comparison model because it achieves the strongest overall R²/MSE performance and remains consistent with the non-linear behavior-feature setting. The auxiliary productivity_score task has R²=-0.0041, so it is kept as a weak-prediction result.</w:t>
       </w:r>
     </w:p>
     <w:p>
@@ -3624,28 +3761,28 @@
           <w:color w:val="9B1C1C"/>
           <w:sz w:val="21"/>
         </w:rPr>
-        <w:t>[INSERT TABLE9 SCREENSHOT HERE: screenshot_tables/table9_regression_metrics.xlsx]</w:t>
-      </w:r>
-    </w:p>
-    <w:p>
-      <w:pPr>
-        <w:spacing w:line="269" w:lineRule="auto" w:after="100"/>
-      </w:pPr>
-      <w:r>
-        <w:rPr>
-          <w:rFonts w:ascii="Calibri" w:hAnsi="Calibri" w:eastAsia="Calibri"/>
-          <w:b/>
-          <w:sz w:val="22"/>
-        </w:rPr>
-        <w:t>Table9</w:t>
-      </w:r>
-      <w:r>
-        <w:rPr>
-          <w:rFonts w:ascii="Calibri" w:hAnsi="Calibri" w:eastAsia="Calibri"/>
-          <w:b w:val="0"/>
-          <w:sz w:val="22"/>
-        </w:rPr>
-        <w:t xml:space="preserve"> Regression Metrics</w:t>
+        <w:t>[INSERT TABLE11 SCREENSHOT HERE: screenshot_tables/table11_regression_model_comparison.xlsx]</w:t>
+      </w:r>
+    </w:p>
+    <w:p>
+      <w:pPr>
+        <w:spacing w:line="269" w:lineRule="auto" w:after="100"/>
+      </w:pPr>
+      <w:r>
+        <w:rPr>
+          <w:rFonts w:ascii="Calibri" w:hAnsi="Calibri" w:eastAsia="Calibri"/>
+          <w:b/>
+          <w:sz w:val="22"/>
+        </w:rPr>
+        <w:t>Table11</w:t>
+      </w:r>
+      <w:r>
+        <w:rPr>
+          <w:rFonts w:ascii="Calibri" w:hAnsi="Calibri" w:eastAsia="Calibri"/>
+          <w:b w:val="0"/>
+          <w:sz w:val="22"/>
+        </w:rPr>
+        <w:t xml:space="preserve"> Regression Model Comparison</w:t>
       </w:r>
     </w:p>
     <w:p>
@@ -3666,7 +3803,7 @@
           <w:b w:val="0"/>
           <w:sz w:val="22"/>
         </w:rPr>
-        <w:t xml:space="preserve"> This screenshot compares the regression results for digital_dependence_score and productivity_score.</w:t>
+        <w:t xml:space="preserve"> This screenshot compares models for digital_dependence_score and productivity_score using R², MSE, RMSE, MAE, and cross-validation scores.</w:t>
       </w:r>
     </w:p>
     <w:p>
@@ -3708,7 +3845,7 @@
           <w:b w:val="0"/>
           <w:sz w:val="22"/>
         </w:rPr>
-        <w:t xml:space="preserve"> The contrast is important because it shows that model performance depends on whether the selected features contain enough information for the target variable.</w:t>
+        <w:t xml:space="preserve"> The contrast is important because it shows that the same feature set can strongly represent digital dependence but cannot explain productivity well.</w:t>
       </w:r>
     </w:p>
     <w:p>
@@ -3933,7 +4070,7 @@
           <w:b w:val="0"/>
           <w:sz w:val="22"/>
         </w:rPr>
-        <w:t xml:space="preserve"> The points are widely scattered instead of staying close to the diagonal reference line. This pattern is consistent with the weak R²=-0.0041 result.</w:t>
+        <w:t xml:space="preserve"> The points are widely scattered instead of staying close to the diagonal reference line. The nearly horizontal prediction pattern suggests that the model tends to predict values near the average productivity level instead of capturing individual productivity differences. This pattern is consistent with the weak R²=-0.0041 result.</w:t>
       </w:r>
     </w:p>
     <w:p>
@@ -3968,7 +4105,7 @@
           <w:color w:val="9B1C1C"/>
           <w:sz w:val="21"/>
         </w:rPr>
-        <w:t>[PASTE CODE6 HERE FROM report_code_snippets.md: Code6 Regression Evaluation]</w:t>
+        <w:t>[PASTE CODE6 HERE FROM report_code_snippets.md: Code6 Regression Model Evaluation]</w:t>
       </w:r>
     </w:p>
     <w:p>
@@ -4065,6 +4202,19 @@
     </w:p>
     <w:p>
       <w:pPr>
+        <w:spacing w:line="269" w:lineRule="auto" w:after="100"/>
+      </w:pPr>
+      <w:r>
+        <w:rPr>
+          <w:rFonts w:ascii="Calibri" w:hAnsi="Calibri" w:eastAsia="Calibri"/>
+          <w:b w:val="0"/>
+          <w:sz w:val="22"/>
+        </w:rPr>
+        <w:t>KMeans, AgglomerativeClustering, and GaussianMixture are compared. Candidate k values are evaluated with the elbow method, Silhouette, Calinski-Harabasz, and Davies-Bouldin. KMeans k=3 is selected because it gives the most suitable silhouette among the tested KMeans settings and produces three readable lifestyle profiles.</w:t>
+      </w:r>
+    </w:p>
+    <w:p>
+      <w:pPr>
         <w:spacing w:before="80" w:after="80"/>
       </w:pPr>
       <w:r>
@@ -4074,28 +4224,28 @@
           <w:color w:val="9B1C1C"/>
           <w:sz w:val="21"/>
         </w:rPr>
-        <w:t>[INSERT TABLE10 SCREENSHOT HERE: screenshot_tables/table10_clustering_profiles.xlsx]</w:t>
-      </w:r>
-    </w:p>
-    <w:p>
-      <w:pPr>
-        <w:spacing w:line="269" w:lineRule="auto" w:after="100"/>
-      </w:pPr>
-      <w:r>
-        <w:rPr>
-          <w:rFonts w:ascii="Calibri" w:hAnsi="Calibri" w:eastAsia="Calibri"/>
-          <w:b/>
-          <w:sz w:val="22"/>
-        </w:rPr>
-        <w:t>Table10</w:t>
-      </w:r>
-      <w:r>
-        <w:rPr>
-          <w:rFonts w:ascii="Calibri" w:hAnsi="Calibri" w:eastAsia="Calibri"/>
-          <w:b w:val="0"/>
-          <w:sz w:val="22"/>
-        </w:rPr>
-        <w:t xml:space="preserve"> Clustering Profiles</w:t>
+        <w:t>[INSERT TABLE12 SCREENSHOT HERE: screenshot_tables/table12_clustering_model_comparison_and_cluster_profiles.xlsx]</w:t>
+      </w:r>
+    </w:p>
+    <w:p>
+      <w:pPr>
+        <w:spacing w:line="269" w:lineRule="auto" w:after="100"/>
+      </w:pPr>
+      <w:r>
+        <w:rPr>
+          <w:rFonts w:ascii="Calibri" w:hAnsi="Calibri" w:eastAsia="Calibri"/>
+          <w:b/>
+          <w:sz w:val="22"/>
+        </w:rPr>
+        <w:t>Table12</w:t>
+      </w:r>
+      <w:r>
+        <w:rPr>
+          <w:rFonts w:ascii="Calibri" w:hAnsi="Calibri" w:eastAsia="Calibri"/>
+          <w:b w:val="0"/>
+          <w:sz w:val="22"/>
+        </w:rPr>
+        <w:t xml:space="preserve"> Clustering Model Comparison and Cluster Profiles</w:t>
       </w:r>
     </w:p>
     <w:p>
@@ -4116,7 +4266,7 @@
           <w:b w:val="0"/>
           <w:sz w:val="22"/>
         </w:rPr>
-        <w:t xml:space="preserve"> This screenshot records KMeans k=3, Silhouette=0.1860, and the compact cluster profiles.</w:t>
+        <w:t xml:space="preserve"> This screenshot records KMeans, AgglomerativeClustering, GaussianMixture, k-selection metrics, and the compact cluster profiles.</w:t>
       </w:r>
     </w:p>
     <w:p>
@@ -4158,7 +4308,7 @@
           <w:b w:val="0"/>
           <w:sz w:val="22"/>
         </w:rPr>
-        <w:t xml:space="preserve"> The profiles are readable, but the low silhouette score means the cluster boundaries are weak.</w:t>
+        <w:t xml:space="preserve"> The profiles are readable, but Silhouette=0.1860 is low, so the result is an exploratory summary rather than a strict grouping rule.</w:t>
       </w:r>
     </w:p>
     <w:p>
@@ -4281,7 +4431,7 @@
           <w:b w:val="0"/>
           <w:sz w:val="22"/>
         </w:rPr>
-        <w:t xml:space="preserve"> k=3 is selected because it gives a readable profile structure and the best silhouette result, but Silhouette=0.1860 still requires cautious interpretation.</w:t>
+        <w:t xml:space="preserve"> Although k=3 is selected, the silhouette value is still low. Therefore, k selection supports exploration, not strict segmentation.</w:t>
       </w:r>
     </w:p>
     <w:p>
@@ -4464,7 +4614,7 @@
           <w:b w:val="0"/>
           <w:sz w:val="22"/>
         </w:rPr>
-        <w:t xml:space="preserve"> PCA Variance and Two-Dimensional Structure</w:t>
+        <w:t xml:space="preserve"> PCA Explained Variance for Dimensionality Reduction</w:t>
       </w:r>
     </w:p>
     <w:p>
@@ -4485,7 +4635,7 @@
           <w:b w:val="0"/>
           <w:sz w:val="22"/>
         </w:rPr>
-        <w:t xml:space="preserve"> This figure provides dimensionality-reduction evidence for the PCA extension used in preprocessing and clustering interpretation.</w:t>
+        <w:t xml:space="preserve"> This figure records how much variance is explained by the leading principal components.</w:t>
       </w:r>
     </w:p>
     <w:p>
@@ -4506,7 +4656,7 @@
           <w:b w:val="0"/>
           <w:sz w:val="22"/>
         </w:rPr>
-        <w:t xml:space="preserve"> The first two principal components explain about 42.41% of the total variance. Therefore, a two-dimensional view captures part of the structure but not the whole high-dimensional dataset.</w:t>
+        <w:t xml:space="preserve"> The first two principal components explain about 42.41% of the total variance.</w:t>
       </w:r>
     </w:p>
     <w:p>
@@ -4527,7 +4677,7 @@
           <w:b w:val="0"/>
           <w:sz w:val="22"/>
         </w:rPr>
-        <w:t xml:space="preserve"> PCA is useful for auxiliary structure understanding, but it should not replace the original feature space for classification, regression, or final clustering evaluation.</w:t>
+        <w:t xml:space="preserve"> PCA is useful for auxiliary visualization and structure understanding, but it should not replace the original feature space for modeling.</w:t>
       </w:r>
     </w:p>
     <w:p>
@@ -4541,7 +4691,7 @@
           <w:color w:val="9B1C1C"/>
           <w:sz w:val="21"/>
         </w:rPr>
-        <w:t>[PASTE CODE7 HERE FROM report_code_snippets.md: Code7 Clustering and K Selection]</w:t>
+        <w:t>[PASTE CODE7 HERE FROM report_code_snippets.md: Code7 Clustering Model Comparison and k Selection]</w:t>
       </w:r>
     </w:p>
     <w:p>
@@ -4710,6 +4860,19 @@
     </w:p>
     <w:p>
       <w:pPr>
+        <w:spacing w:line="269" w:lineRule="auto" w:after="100"/>
+      </w:pPr>
+      <w:r>
+        <w:rPr>
+          <w:rFonts w:ascii="Calibri" w:hAnsi="Calibri" w:eastAsia="Calibri"/>
+          <w:b w:val="0"/>
+          <w:sz w:val="22"/>
+        </w:rPr>
+        <w:t>The whole workflow leads to a consistent conclusion. The data-quality checks show that the dataset can be used without deleting records. Feature engineering transforms raw counts and minutes into behavior-intensity variables. EDA then shows class imbalance, group overlap, and different correlation strengths among target variables. Based on these findings, the classification model is designed as a recall-oriented High Risk screening reference, the regression model successfully represents digital dependence but not productivity, and clustering provides readable but weakly separated lifestyle profiles. Therefore, the final value of the report is not perfect prediction, but a complete and explainable data analysis workflow.</w:t>
+      </w:r>
+    </w:p>
+    <w:p>
+      <w:pPr>
         <w:pStyle w:val="2"/>
       </w:pPr>
       <w:r>
@@ -4924,72 +5087,6 @@
           <w:sz w:val="21"/>
         </w:rPr>
         <w:t>[PASTE COMPLETE RUNNABLE CODE HERE]</w:t>
-      </w:r>
-    </w:p>
-    <w:p>
-      <w:pPr>
-        <w:spacing w:before="80" w:after="80"/>
-      </w:pPr>
-      <w:r>
-        <w:rPr>
-          <w:rFonts w:ascii="Consolas" w:hAnsi="Consolas" w:eastAsia="Consolas"/>
-          <w:b/>
-          <w:color w:val="9B1C1C"/>
-          <w:sz w:val="21"/>
-        </w:rPr>
-        <w:t>[PASTE CODE8 HERE FROM report_code_snippets.md: Code8 Export Figures and Screenshot Tables]</w:t>
-      </w:r>
-    </w:p>
-    <w:p>
-      <w:pPr>
-        <w:spacing w:line="269" w:lineRule="auto" w:after="100"/>
-      </w:pPr>
-      <w:r>
-        <w:rPr>
-          <w:rFonts w:ascii="Calibri" w:hAnsi="Calibri" w:eastAsia="Calibri"/>
-          <w:b w:val="0"/>
-          <w:sz w:val="22"/>
-        </w:rPr>
-        <w:t>Explanation: This code is used to export final PNG figures and screenshot-ready Excel tables.</w:t>
-      </w:r>
-    </w:p>
-    <w:p>
-      <w:pPr>
-        <w:spacing w:line="269" w:lineRule="auto" w:after="100"/>
-      </w:pPr>
-      <w:r>
-        <w:rPr>
-          <w:rFonts w:ascii="Calibri" w:hAnsi="Calibri" w:eastAsia="Calibri"/>
-          <w:b w:val="0"/>
-          <w:sz w:val="22"/>
-        </w:rPr>
-        <w:t>It is necessary because the final report needs visual evidence and process evidence.</w:t>
-      </w:r>
-    </w:p>
-    <w:p>
-      <w:pPr>
-        <w:spacing w:line="269" w:lineRule="auto" w:after="100"/>
-      </w:pPr>
-      <w:r>
-        <w:rPr>
-          <w:rFonts w:ascii="Calibri" w:hAnsi="Calibri" w:eastAsia="Calibri"/>
-          <w:b w:val="0"/>
-          <w:sz w:val="22"/>
-        </w:rPr>
-        <w:t>The output is figures/final_report/ and screenshot_tables/ files.</w:t>
-      </w:r>
-    </w:p>
-    <w:p>
-      <w:pPr>
-        <w:spacing w:line="269" w:lineRule="auto" w:after="100"/>
-      </w:pPr>
-      <w:r>
-        <w:rPr>
-          <w:rFonts w:ascii="Calibri" w:hAnsi="Calibri" w:eastAsia="Calibri"/>
-          <w:b w:val="0"/>
-          <w:sz w:val="22"/>
-        </w:rPr>
-        <w:t>This result supports the student's final screenshot and code-paste workflow.</w:t>
       </w:r>
     </w:p>
     <w:sectPr>

</xml_diff>

<commit_message>
Finalize workflow report dependencies and checks
</commit_message>
<xml_diff>
--- a/期末考查报告_数字生活方式分析/final_submit/大数据分析与应用期末考查报告.docx
+++ b/期末考查报告_数字生活方式分析/final_submit/大数据分析与应用期末考查报告.docx
@@ -1370,7 +1370,7 @@
           <w:b w:val="0"/>
           <w:sz w:val="22"/>
         </w:rPr>
-        <w:t>This step reads the original CSV and confirms the basic shape of the dataset. The output is 3500 rows and 24 fields.</w:t>
+        <w:t>This step reads the original CSV and confirms the basic shape of the dataset. The output is 3500 rows and 24 fields. The raw preview prepared in Table1 is the input evidence for this loading step.</w:t>
       </w:r>
     </w:p>
     <w:p>
@@ -2358,6 +2358,19 @@
           <w:sz w:val="22"/>
         </w:rPr>
         <w:t xml:space="preserve"> The PCA evidence supports dimensionality-reduction discussion, but PCA is used only for auxiliary understanding rather than replacing the original modeling features.</w:t>
+      </w:r>
+    </w:p>
+    <w:p>
+      <w:pPr>
+        <w:spacing w:line="269" w:lineRule="auto" w:after="100"/>
+      </w:pPr>
+      <w:r>
+        <w:rPr>
+          <w:rFonts w:ascii="Calibri" w:hAnsi="Calibri" w:eastAsia="Calibri"/>
+          <w:b w:val="0"/>
+          <w:sz w:val="22"/>
+        </w:rPr>
+        <w:t>After preprocessing, the dataset keeps all 3500 records, adds behavior-intensity features, and separates task-specific feature sets. Therefore, the later models are built on a clean and leakage-controlled table.</w:t>
       </w:r>
     </w:p>
     <w:p>
@@ -3066,6 +3079,19 @@
       </w:r>
     </w:p>
     <w:p>
+      <w:pPr>
+        <w:spacing w:line="269" w:lineRule="auto" w:after="100"/>
+      </w:pPr>
+      <w:r>
+        <w:rPr>
+          <w:rFonts w:ascii="Calibri" w:hAnsi="Calibri" w:eastAsia="Calibri"/>
+          <w:b w:val="0"/>
+          <w:sz w:val="22"/>
+        </w:rPr>
+        <w:t>The statistical summary and visualizations show three useful signals: class imbalance for classification, stronger behavior dependence for digital_dependence_score, and weaker visible patterns for productivity_score.</w:t>
+      </w:r>
+    </w:p>
+    <w:p>
       <w:r>
         <w:br w:type="page"/>
       </w:r>
@@ -3108,20 +3134,20 @@
           <w:b w:val="0"/>
           <w:sz w:val="22"/>
         </w:rPr>
-        <w:t>The supervised tasks use train/test split, random_state=42, cross-validation, and GridSearchCV-style hyperparameter tuning. Different tasks use different evaluation metrics. Classification uses Precision, Recall, F1, PR-AUC, ROC-AUC, Balanced Accuracy, and confusion matrix. Regression uses R², MSE, RMSE, and MAE. Clustering uses elbow method, Silhouette, Calinski-Harabasz, and Davies-Bouldin.</w:t>
-      </w:r>
-    </w:p>
-    <w:p>
-      <w:pPr>
-        <w:spacing w:line="269" w:lineRule="auto" w:after="100"/>
-      </w:pPr>
-      <w:r>
-        <w:rPr>
-          <w:rFonts w:ascii="Calibri" w:hAnsi="Calibri" w:eastAsia="Calibri"/>
-          <w:b w:val="0"/>
-          <w:sz w:val="22"/>
-        </w:rPr>
-        <w:t>The model selection logic is different for each task. Classification focuses on recall-oriented screening and PR-AUC; regression focuses on R², MSE, and MAE; clustering focuses on silhouette, elbow trend, and profile interpretability.</w:t>
+        <w:t>The supervised tasks use train/test split, random_state=42, cross-validation, and GridSearchCV-style hyperparameter tuning. Different tasks use different evaluation metrics. Classification uses Precision, Recall, F1, PR-AUC, ROC-AUC, Balanced Accuracy, and confusion matrix. Regression uses R2, MSE, RMSE, and MAE. Clustering uses elbow method, Silhouette, Calinski-Harabasz, and Davies-Bouldin.</w:t>
+      </w:r>
+    </w:p>
+    <w:p>
+      <w:pPr>
+        <w:spacing w:line="269" w:lineRule="auto" w:after="100"/>
+      </w:pPr>
+      <w:r>
+        <w:rPr>
+          <w:rFonts w:ascii="Calibri" w:hAnsi="Calibri" w:eastAsia="Calibri"/>
+          <w:b w:val="0"/>
+          <w:sz w:val="22"/>
+        </w:rPr>
+        <w:t>The model selection logic is different for each task. Classification focuses on recall-oriented screening and PR-AUC; regression focuses on R2, MSE, and MAE; clustering focuses on silhouette, elbow trend, and profile interpretability.</w:t>
       </w:r>
     </w:p>
     <w:p>
@@ -3161,7 +3187,7 @@
           <w:b w:val="0"/>
           <w:sz w:val="22"/>
         </w:rPr>
-        <w:t>Gradient Boosting is selected because it gives the most suitable overall screening performance under the selected evaluation logic, especially PR-AUC and the final threshold-based Recall/F1 trade-off. Accuracy alone is not enough because the High Risk group is smaller and missed High Risk samples matter more in a screening task.</w:t>
+        <w:t>Gradient Boosting is selected because it provides the most suitable screening trade-off after model comparison and threshold tuning, not because it is perfect on every metric. Accuracy alone is not enough because the High Risk group is smaller and missed High Risk samples matter more in a screening task.</w:t>
       </w:r>
     </w:p>
     <w:p>
@@ -3734,20 +3760,20 @@
           <w:b w:val="0"/>
           <w:sz w:val="22"/>
         </w:rPr>
-        <w:t>The main regression target is digital_dependence_score. Gradient Boosting reaches R²=0.9839, MSE=3.1471, and MAE=0.9982. It is selected because it gives the strongest overall performance under the report's main criterion, especially R² and MSE.</w:t>
-      </w:r>
-    </w:p>
-    <w:p>
-      <w:pPr>
-        <w:spacing w:line="269" w:lineRule="auto" w:after="100"/>
-      </w:pPr>
-      <w:r>
-        <w:rPr>
-          <w:rFonts w:ascii="Calibri" w:hAnsi="Calibri" w:eastAsia="Calibri"/>
-          <w:b w:val="0"/>
-          <w:sz w:val="22"/>
-        </w:rPr>
-        <w:t>Although linear models may have a slightly lower MAE in some results, Gradient Boosting is kept as the final comparison model because it achieves the strongest overall R²/MSE performance and remains consistent with the non-linear behavior-feature setting. The auxiliary productivity_score task has R²=-0.0041, so it is kept as a weak-prediction result.</w:t>
+        <w:t>The main regression target is digital_dependence_score. Gradient Boosting reaches R2=0.9839, MSE=3.1471, and MAE=0.9982. It is selected because it gives the strongest overall performance under the report's main criterion, especially R2 and MSE.</w:t>
+      </w:r>
+    </w:p>
+    <w:p>
+      <w:pPr>
+        <w:spacing w:line="269" w:lineRule="auto" w:after="100"/>
+      </w:pPr>
+      <w:r>
+        <w:rPr>
+          <w:rFonts w:ascii="Calibri" w:hAnsi="Calibri" w:eastAsia="Calibri"/>
+          <w:b w:val="0"/>
+          <w:sz w:val="22"/>
+        </w:rPr>
+        <w:t>Although some linear models may have a slightly lower MAE in digital dependence prediction, Gradient Boosting is kept as the final model because its overall R2 and MSE performance is stronger and it matches the non-linear feature setting. The auxiliary productivity_score task has R2=-0.0041, so it is kept as a weak-prediction result.</w:t>
       </w:r>
     </w:p>
     <w:p>
@@ -3803,7 +3829,7 @@
           <w:b w:val="0"/>
           <w:sz w:val="22"/>
         </w:rPr>
-        <w:t xml:space="preserve"> This screenshot compares models for digital_dependence_score and productivity_score using R², MSE, RMSE, MAE, and cross-validation scores.</w:t>
+        <w:t xml:space="preserve"> This screenshot compares models for digital_dependence_score and productivity_score using R2, MSE, RMSE, MAE, and cross-validation scores.</w:t>
       </w:r>
     </w:p>
     <w:p>
@@ -3947,7 +3973,7 @@
           <w:b w:val="0"/>
           <w:sz w:val="22"/>
         </w:rPr>
-        <w:t xml:space="preserve"> Most points are close to the diagonal line, which is consistent with the high R²=0.9839.</w:t>
+        <w:t xml:space="preserve"> Most points are close to the diagonal line, which is consistent with the high R2=0.9839.</w:t>
       </w:r>
     </w:p>
     <w:p>
@@ -4070,7 +4096,7 @@
           <w:b w:val="0"/>
           <w:sz w:val="22"/>
         </w:rPr>
-        <w:t xml:space="preserve"> The points are widely scattered instead of staying close to the diagonal reference line. The nearly horizontal prediction pattern suggests that the model tends to predict values near the average productivity level instead of capturing individual productivity differences. This pattern is consistent with the weak R²=-0.0041 result.</w:t>
+        <w:t xml:space="preserve"> The points are widely scattered instead of staying close to the diagonal reference line. The nearly horizontal prediction pattern suggests that the model tends to predict values near the average productivity level instead of capturing individual productivity differences. This pattern is consistent with the weak R2=-0.0041 result.</w:t>
       </w:r>
     </w:p>
     <w:p>
@@ -4118,7 +4144,7 @@
           <w:b w:val="0"/>
           <w:sz w:val="22"/>
         </w:rPr>
-        <w:t>Explanation: This code is used to calculate R², MSE, RMSE, and MAE for regression predictions.</w:t>
+        <w:t>Explanation: This code is used to calculate R2, MSE, RMSE, and MAE for regression predictions.</w:t>
       </w:r>
     </w:p>
     <w:p>
@@ -4210,7 +4236,7 @@
           <w:b w:val="0"/>
           <w:sz w:val="22"/>
         </w:rPr>
-        <w:t>KMeans, AgglomerativeClustering, and GaussianMixture are compared. Candidate k values are evaluated with the elbow method, Silhouette, Calinski-Harabasz, and Davies-Bouldin. KMeans k=3 is selected because it gives the most suitable silhouette among the tested KMeans settings and produces three readable lifestyle profiles.</w:t>
+        <w:t>KMeans, AgglomerativeClustering, and GaussianMixture are compared. Candidate k values are evaluated with the elbow method, Silhouette, Calinski-Harabasz, and Davies-Bouldin. KMeans k=3 is selected because it gives the best tested silhouette result and produces readable profiles, but the low silhouette value means the profiles should be treated as exploratory summaries.</w:t>
       </w:r>
     </w:p>
     <w:p>
@@ -4842,7 +4868,7 @@
           <w:b w:val="0"/>
           <w:sz w:val="22"/>
         </w:rPr>
-        <w:t>- digital_dependence_score can be predicted well by the current features, with R²=0.9839, MSE=3.1471, and MAE=0.9982.</w:t>
+        <w:t>- digital_dependence_score can be predicted well by the current features, with R2=0.9839, MSE=3.1471, and MAE=0.9982.</w:t>
       </w:r>
     </w:p>
     <w:p>
@@ -4868,7 +4894,7 @@
           <w:b w:val="0"/>
           <w:sz w:val="22"/>
         </w:rPr>
-        <w:t>The whole workflow leads to a consistent conclusion. The data-quality checks show that the dataset can be used without deleting records. Feature engineering transforms raw counts and minutes into behavior-intensity variables. EDA then shows class imbalance, group overlap, and different correlation strengths among target variables. Based on these findings, the classification model is designed as a recall-oriented High Risk screening reference, the regression model successfully represents digital dependence but not productivity, and clustering provides readable but weakly separated lifestyle profiles. Therefore, the final value of the report is not perfect prediction, but a complete and explainable data analysis workflow.</w:t>
+        <w:t>The workflow is consistent from beginning to end. Data checks confirm that the original table is usable. Feature engineering turns raw behavior records into behavior-intensity variables. EDA explains why recall, PR-AUC, regression metrics, and clustering metrics are needed. The final models then show that High Risk can be screened as a reference, digital dependence can be strongly predicted, productivity is weakly explained, and lifestyle profiles are readable but not sharply separated.</w:t>
       </w:r>
     </w:p>
     <w:p>
@@ -5047,6 +5073,73 @@
           <w:sz w:val="30"/>
         </w:rPr>
         <w:t>Appendix A Complete Runnable Code</w:t>
+      </w:r>
+    </w:p>
+    <w:p>
+      <w:pPr>
+        <w:pStyle w:val="2"/>
+      </w:pPr>
+      <w:r>
+        <w:rPr>
+          <w:rFonts w:ascii="Calibri" w:hAnsi="Calibri" w:eastAsia="Calibri"/>
+          <w:b/>
+          <w:color w:val="2E74B5"/>
+          <w:sz w:val="25"/>
+        </w:rPr>
+        <w:t>A.1 Environment and Dependencies</w:t>
+      </w:r>
+    </w:p>
+    <w:p>
+      <w:pPr>
+        <w:spacing w:line="269" w:lineRule="auto" w:after="100"/>
+      </w:pPr>
+      <w:r>
+        <w:rPr>
+          <w:rFonts w:ascii="Calibri" w:hAnsi="Calibri" w:eastAsia="Calibri"/>
+          <w:b w:val="0"/>
+          <w:sz w:val="22"/>
+        </w:rPr>
+        <w:t>The experiment was completed with a CPU-based Python environment. The main dependencies are pandas, NumPy, scikit-learn, Matplotlib, openpyxl, python-docx, and joblib. The environment can be installed with:</w:t>
+      </w:r>
+    </w:p>
+    <w:p>
+      <w:pPr>
+        <w:spacing w:line="269" w:lineRule="auto" w:after="100"/>
+      </w:pPr>
+      <w:r>
+        <w:rPr>
+          <w:rFonts w:ascii="Calibri" w:hAnsi="Calibri" w:eastAsia="Calibri"/>
+          <w:b w:val="0"/>
+          <w:sz w:val="22"/>
+        </w:rPr>
+        <w:t>pip install -r requirements.txt</w:t>
+      </w:r>
+    </w:p>
+    <w:p>
+      <w:pPr>
+        <w:spacing w:line="269" w:lineRule="auto" w:after="100"/>
+      </w:pPr>
+      <w:r>
+        <w:rPr>
+          <w:rFonts w:ascii="Calibri" w:hAnsi="Calibri" w:eastAsia="Calibri"/>
+          <w:b w:val="0"/>
+          <w:sz w:val="22"/>
+        </w:rPr>
+        <w:t>The complete runnable code below can regenerate preprocessing checks, screenshot Excel tables, figures, model metrics, and final result files.</w:t>
+      </w:r>
+    </w:p>
+    <w:p>
+      <w:pPr>
+        <w:pStyle w:val="2"/>
+      </w:pPr>
+      <w:r>
+        <w:rPr>
+          <w:rFonts w:ascii="Calibri" w:hAnsi="Calibri" w:eastAsia="Calibri"/>
+          <w:b/>
+          <w:color w:val="2E74B5"/>
+          <w:sz w:val="25"/>
+        </w:rPr>
+        <w:t>A.2 Complete Runnable Code</w:t>
       </w:r>
     </w:p>
     <w:p>

</xml_diff>